<commit_message>
v4.1.7-RC-0.0.8 changed post formular parameter handling to sbp:keyA=valueA&sbp:keyB=valueB
</commit_message>
<xml_diff>
--- a/doc/AnbindungExterneWebanwendung.docx
+++ b/doc/AnbindungExterneWebanwendung.docx
@@ -473,18 +473,8 @@
                 <w:szCs w:val="22"/>
                 <w:lang w:val="en-US"/>
               </w:rPr>
-              <w:t xml:space="preserve">Andreas </w:t>
+              <w:t>Andreas Fitzek</w:t>
             </w:r>
-            <w:proofErr w:type="spellStart"/>
-            <w:r>
-              <w:rPr>
-                <w:sz w:val="22"/>
-                <w:szCs w:val="22"/>
-                <w:lang w:val="en-US"/>
-              </w:rPr>
-              <w:t>Fitzek</w:t>
-            </w:r>
-            <w:proofErr w:type="spellEnd"/>
             <w:r>
               <w:rPr>
                 <w:sz w:val="22"/>
@@ -534,85 +524,19 @@
               <w:rPr>
                 <w:lang w:val="en-US"/>
               </w:rPr>
-              <w:t xml:space="preserve">Christian </w:t>
+              <w:t xml:space="preserve">Christian Maierhofer – </w:t>
             </w:r>
-            <w:proofErr w:type="spellStart"/>
-            <w:r>
-              <w:rPr>
-                <w:lang w:val="en-US"/>
-              </w:rPr>
-              <w:t>Maierhofer</w:t>
-            </w:r>
-            <w:proofErr w:type="spellEnd"/>
-            <w:r>
-              <w:rPr>
-                <w:lang w:val="en-US"/>
-              </w:rPr>
-              <w:t xml:space="preserve"> – </w:t>
-            </w:r>
-            <w:r>
-              <w:rPr>
-                <w:rStyle w:val="Hyperlink"/>
-                <w:rFonts w:eastAsiaTheme="majorEastAsia" w:cstheme="majorBidi"/>
-                <w:kern w:val="28"/>
-                <w:lang w:val="en-US"/>
-              </w:rPr>
-              <w:fldChar w:fldCharType="begin"/>
-            </w:r>
-            <w:r>
-              <w:rPr>
-                <w:rStyle w:val="Hyperlink"/>
-                <w:rFonts w:eastAsiaTheme="majorEastAsia" w:cstheme="majorBidi"/>
-                <w:kern w:val="28"/>
-                <w:lang w:val="en-US"/>
-              </w:rPr>
-              <w:instrText xml:space="preserve"> HYPERLINK "mailto:</w:instrText>
-            </w:r>
-            <w:r>
-              <w:rPr>
-                <w:rStyle w:val="Hyperlink"/>
-                <w:rFonts w:eastAsiaTheme="majorEastAsia" w:cstheme="majorBidi"/>
-                <w:kern w:val="28"/>
-                <w:lang w:val="en-US"/>
-              </w:rPr>
-              <w:instrText>christian.maierhofer@egiz.gv.at</w:instrText>
-            </w:r>
-            <w:r>
-              <w:rPr>
-                <w:rStyle w:val="Hyperlink"/>
-                <w:rFonts w:eastAsiaTheme="majorEastAsia" w:cstheme="majorBidi"/>
-                <w:kern w:val="28"/>
-                <w:lang w:val="en-US"/>
-              </w:rPr>
-              <w:instrText xml:space="preserve">" </w:instrText>
-            </w:r>
-            <w:r>
-              <w:rPr>
-                <w:rStyle w:val="Hyperlink"/>
-                <w:rFonts w:eastAsiaTheme="majorEastAsia" w:cstheme="majorBidi"/>
-                <w:kern w:val="28"/>
-                <w:lang w:val="en-US"/>
-              </w:rPr>
-              <w:fldChar w:fldCharType="separate"/>
-            </w:r>
-            <w:r>
-              <w:rPr>
-                <w:rStyle w:val="Hyperlink"/>
-                <w:rFonts w:eastAsiaTheme="majorEastAsia" w:cstheme="majorBidi"/>
-                <w:kern w:val="28"/>
-                <w:lang w:val="en-US"/>
-              </w:rPr>
-              <w:t>christian.maierhofer@egiz.gv.at</w:t>
-            </w:r>
-            <w:r>
-              <w:rPr>
-                <w:rStyle w:val="Hyperlink"/>
-                <w:rFonts w:eastAsiaTheme="majorEastAsia" w:cstheme="majorBidi"/>
-                <w:kern w:val="28"/>
-                <w:lang w:val="en-US"/>
-              </w:rPr>
-              <w:fldChar w:fldCharType="end"/>
-            </w:r>
+            <w:hyperlink r:id="rId12" w:history="1">
+              <w:r>
+                <w:rPr>
+                  <w:rStyle w:val="Hyperlink"/>
+                  <w:rFonts w:eastAsiaTheme="majorEastAsia" w:cstheme="majorBidi"/>
+                  <w:kern w:val="28"/>
+                  <w:lang w:val="en-US"/>
+                </w:rPr>
+                <w:t>christian.maierhofer@egiz.gv.at</w:t>
+              </w:r>
+            </w:hyperlink>
           </w:p>
           <w:p>
             <w:pPr>
@@ -626,25 +550,7 @@
                 <w:rFonts w:eastAsiaTheme="majorEastAsia" w:cstheme="majorBidi"/>
                 <w:kern w:val="28"/>
               </w:rPr>
-              <w:t xml:space="preserve">Alexander </w:t>
-            </w:r>
-            <w:proofErr w:type="spellStart"/>
-            <w:r>
-              <w:rPr>
-                <w:rStyle w:val="Hyperlink"/>
-                <w:rFonts w:eastAsiaTheme="majorEastAsia" w:cstheme="majorBidi"/>
-                <w:kern w:val="28"/>
-              </w:rPr>
-              <w:t>Marsalek</w:t>
-            </w:r>
-            <w:proofErr w:type="spellEnd"/>
-            <w:r>
-              <w:rPr>
-                <w:rStyle w:val="Hyperlink"/>
-                <w:rFonts w:eastAsiaTheme="majorEastAsia" w:cstheme="majorBidi"/>
-                <w:kern w:val="28"/>
-              </w:rPr>
-              <w:t xml:space="preserve"> </w:t>
+              <w:t xml:space="preserve">Alexander Marsalek </w:t>
             </w:r>
             <w:r>
               <w:rPr>
@@ -652,7 +558,7 @@
               </w:rPr>
               <w:t xml:space="preserve">– </w:t>
             </w:r>
-            <w:hyperlink r:id="rId12" w:history="1">
+            <w:hyperlink r:id="rId13" w:history="1">
               <w:r>
                 <w:rPr>
                   <w:rStyle w:val="Hyperlink"/>
@@ -660,34 +566,7 @@
                   <w:kern w:val="28"/>
                   <w:lang w:val="en-US"/>
                 </w:rPr>
-                <w:t>alexander.marsalek</w:t>
-              </w:r>
-              <w:r>
-                <w:rPr>
-                  <w:rStyle w:val="Hyperlink"/>
-                  <w:rFonts w:eastAsiaTheme="majorEastAsia" w:cstheme="majorBidi"/>
-                  <w:kern w:val="28"/>
-                  <w:lang w:val="en-US"/>
-                </w:rPr>
-                <w:t>@</w:t>
-              </w:r>
-              <w:r>
-                <w:rPr>
-                  <w:rStyle w:val="Hyperlink"/>
-                  <w:rFonts w:eastAsiaTheme="majorEastAsia" w:cstheme="majorBidi"/>
-                  <w:kern w:val="28"/>
-                  <w:lang w:val="en-US"/>
-                </w:rPr>
-                <w:t>a-sit</w:t>
-              </w:r>
-              <w:r>
-                <w:rPr>
-                  <w:rStyle w:val="Hyperlink"/>
-                  <w:rFonts w:eastAsiaTheme="majorEastAsia" w:cstheme="majorBidi"/>
-                  <w:kern w:val="28"/>
-                  <w:lang w:val="en-US"/>
-                </w:rPr>
-                <w:t>.at</w:t>
+                <w:t>alexander.marsalek@a-sit.at</w:t>
               </w:r>
             </w:hyperlink>
           </w:p>
@@ -2088,15 +1967,7 @@
         <w:t xml:space="preserve">: </w:t>
       </w:r>
       <w:r>
-        <w:t xml:space="preserve">In dieser Möglichkeit wird das zu signierende PDF per SOAP Service von der externen Webanwendung direkt an PDF-AS-WEB hochgeladen. Als Antwort erhält die externe Webanwendung das signierte Dokument. Diese Möglichkeit funktioniert nur wenn das </w:t>
-      </w:r>
-      <w:proofErr w:type="gramStart"/>
-      <w:r>
-        <w:t>PDF Dokument</w:t>
-      </w:r>
-      <w:proofErr w:type="gramEnd"/>
-      <w:r>
-        <w:t xml:space="preserve"> direkt vom Server signiert werden soll.</w:t>
+        <w:t>In dieser Möglichkeit wird das zu signierende PDF per SOAP Service von der externen Webanwendung direkt an PDF-AS-WEB hochgeladen. Als Antwort erhält die externe Webanwendung das signierte Dokument. Diese Möglichkeit funktioniert nur wenn das PDF Dokument direkt vom Server signiert werden soll.</w:t>
       </w:r>
     </w:p>
     <w:p>
@@ -2147,15 +2018,7 @@
         <w:t>der Signatur</w:t>
       </w:r>
       <w:r>
-        <w:t xml:space="preserve"> eines </w:t>
-      </w:r>
-      <w:proofErr w:type="gramStart"/>
-      <w:r>
-        <w:t>PDF Dokumentes</w:t>
-      </w:r>
-      <w:proofErr w:type="gramEnd"/>
-      <w:r>
-        <w:t xml:space="preserve"> einer externen Webanwendung durch PDF-AS-WEB dargestellt.</w:t>
+        <w:t xml:space="preserve"> eines PDF Dokumentes einer externen Webanwendung durch PDF-AS-WEB dargestellt.</w:t>
       </w:r>
     </w:p>
     <w:p>
@@ -2186,7 +2049,7 @@
                     </pic:cNvPicPr>
                   </pic:nvPicPr>
                   <pic:blipFill>
-                    <a:blip r:embed="rId13">
+                    <a:blip r:embed="rId14">
                       <a:extLst>
                         <a:ext uri="{28A0092B-C50C-407E-A947-70E740481C1C}">
                           <a14:useLocalDpi xmlns:a14="http://schemas.microsoft.com/office/drawing/2010/main" val="0"/>
@@ -2327,21 +2190,7 @@
         <w:rPr>
           <w:lang w:val="de-AT"/>
         </w:rPr>
-        <w:t xml:space="preserve">ter. Im ersten Request des Benutzers an PDF-AS-WEB kann entweder das zu signierende </w:t>
-      </w:r>
-      <w:proofErr w:type="gramStart"/>
-      <w:r>
-        <w:rPr>
-          <w:lang w:val="de-AT"/>
-        </w:rPr>
-        <w:t>PDF Dokument</w:t>
-      </w:r>
-      <w:proofErr w:type="gramEnd"/>
-      <w:r>
-        <w:rPr>
-          <w:lang w:val="de-AT"/>
-        </w:rPr>
-        <w:t xml:space="preserve"> per POST Request hoch</w:t>
+        <w:t>ter. Im ersten Request des Benutzers an PDF-AS-WEB kann entweder das zu signierende PDF Dokument per POST Request hoch</w:t>
       </w:r>
       <w:r>
         <w:rPr>
@@ -2401,21 +2250,7 @@
         <w:rPr>
           <w:lang w:val="de-AT"/>
         </w:rPr>
-        <w:t xml:space="preserve"> zu signierenden </w:t>
-      </w:r>
-      <w:proofErr w:type="gramStart"/>
-      <w:r>
-        <w:rPr>
-          <w:lang w:val="de-AT"/>
-        </w:rPr>
-        <w:t>PDF Dokumentes</w:t>
-      </w:r>
-      <w:proofErr w:type="gramEnd"/>
-      <w:r>
-        <w:rPr>
-          <w:lang w:val="de-AT"/>
-        </w:rPr>
-        <w:t xml:space="preserve"> ist wird </w:t>
+        <w:t xml:space="preserve"> zu signierenden PDF Dokumentes ist wird </w:t>
       </w:r>
       <w:r>
         <w:rPr>
@@ -2463,14 +2298,7 @@
         <w:rPr>
           <w:lang w:val="de-AT"/>
         </w:rPr>
-        <w:t xml:space="preserve">ity Layer </w:t>
-      </w:r>
-      <w:proofErr w:type="spellStart"/>
-      <w:r>
-        <w:rPr>
-          <w:lang w:val="de-AT"/>
-        </w:rPr>
-        <w:t>Request</w:t>
+        <w:t>ity Layer Request</w:t>
       </w:r>
       <w:r>
         <w:rPr>
@@ -2478,7 +2306,6 @@
         </w:rPr>
         <w:t>s</w:t>
       </w:r>
-      <w:proofErr w:type="spellEnd"/>
       <w:r>
         <w:rPr>
           <w:lang w:val="de-AT"/>
@@ -2503,19 +2330,11 @@
         </w:rPr>
         <w:t xml:space="preserve"> das </w:t>
       </w:r>
-      <w:proofErr w:type="spellStart"/>
-      <w:r>
-        <w:rPr>
-          <w:lang w:val="de-AT"/>
-        </w:rPr>
-        <w:t>ProvidePDF</w:t>
-      </w:r>
-      <w:proofErr w:type="spellEnd"/>
-      <w:r>
-        <w:rPr>
-          <w:lang w:val="de-AT"/>
-        </w:rPr>
-        <w:t xml:space="preserve"> Servlet mit entsprechender</w:t>
+      <w:r>
+        <w:rPr>
+          <w:lang w:val="de-AT"/>
+        </w:rPr>
+        <w:t>ProvidePDF Servlet mit entsprechender</w:t>
       </w:r>
       <w:r>
         <w:rPr>
@@ -2533,63 +2352,7 @@
         <w:rPr>
           <w:lang w:val="de-AT"/>
         </w:rPr>
-        <w:t xml:space="preserve">rgerkartenumgebung auf das </w:t>
-      </w:r>
-      <w:proofErr w:type="spellStart"/>
-      <w:r>
-        <w:rPr>
-          <w:lang w:val="de-AT"/>
-        </w:rPr>
-        <w:t>ProvidePDF</w:t>
-      </w:r>
-      <w:proofErr w:type="spellEnd"/>
-      <w:r>
-        <w:rPr>
-          <w:lang w:val="de-AT"/>
-        </w:rPr>
-        <w:t xml:space="preserve"> Servlet von PDF-AS-WEB weitergeleitet. Je nachdem ob die externe Webanwendung eine </w:t>
-      </w:r>
-      <w:proofErr w:type="spellStart"/>
-      <w:r>
-        <w:rPr>
-          <w:lang w:val="de-AT"/>
-        </w:rPr>
-        <w:t>InvokeURL</w:t>
-      </w:r>
-      <w:proofErr w:type="spellEnd"/>
-      <w:r>
-        <w:rPr>
-          <w:lang w:val="de-AT"/>
-        </w:rPr>
-        <w:t xml:space="preserve"> angegeben hat, wird der Benutzer auf diese URL weitergeleitet, oder es wird dem Benutzer angeboten das </w:t>
-      </w:r>
-      <w:proofErr w:type="gramStart"/>
-      <w:r>
-        <w:rPr>
-          <w:lang w:val="de-AT"/>
-        </w:rPr>
-        <w:t>PDF Dokument</w:t>
-      </w:r>
-      <w:proofErr w:type="gramEnd"/>
-      <w:r>
-        <w:rPr>
-          <w:lang w:val="de-AT"/>
-        </w:rPr>
-        <w:t xml:space="preserve"> direkt von PDF-AS herunter zu laden. Ein signiertes </w:t>
-      </w:r>
-      <w:proofErr w:type="gramStart"/>
-      <w:r>
-        <w:rPr>
-          <w:lang w:val="de-AT"/>
-        </w:rPr>
-        <w:t>PDF Dokument</w:t>
-      </w:r>
-      <w:proofErr w:type="gramEnd"/>
-      <w:r>
-        <w:rPr>
-          <w:lang w:val="de-AT"/>
-        </w:rPr>
-        <w:t xml:space="preserve"> kann nur ein einziges </w:t>
+        <w:t xml:space="preserve">rgerkartenumgebung auf das ProvidePDF Servlet von PDF-AS-WEB weitergeleitet. Je nachdem ob die externe Webanwendung eine InvokeURL angegeben hat, wird der Benutzer auf diese URL weitergeleitet, oder es wird dem Benutzer angeboten das PDF Dokument direkt von PDF-AS herunter zu laden. Ein signiertes PDF Dokument kann nur ein einziges </w:t>
       </w:r>
       <w:r>
         <w:rPr>
@@ -2644,21 +2407,7 @@
         <w:rPr>
           <w:lang w:val="de-AT"/>
         </w:rPr>
-        <w:t xml:space="preserve"> des signierten </w:t>
-      </w:r>
-      <w:proofErr w:type="gramStart"/>
-      <w:r>
-        <w:rPr>
-          <w:lang w:val="de-AT"/>
-        </w:rPr>
-        <w:t>PDF Dokumentes</w:t>
-      </w:r>
-      <w:proofErr w:type="gramEnd"/>
-      <w:r>
-        <w:rPr>
-          <w:lang w:val="de-AT"/>
-        </w:rPr>
-        <w:t xml:space="preserve"> </w:t>
+        <w:t xml:space="preserve"> des signierten PDF Dokumentes </w:t>
       </w:r>
       <w:r>
         <w:rPr>
@@ -2704,43 +2453,19 @@
       <w:bookmarkEnd w:id="5"/>
     </w:p>
     <w:p>
-      <w:proofErr w:type="gramStart"/>
-      <w:r>
-        <w:t>Die Endpunkt</w:t>
-      </w:r>
-      <w:proofErr w:type="gramEnd"/>
-      <w:r>
-        <w:t xml:space="preserve"> für das SOAP Webservice in PDF-AS-WEB befindet sich unter „</w:t>
-      </w:r>
-      <w:proofErr w:type="spellStart"/>
+      <w:r>
+        <w:t>Die Endpunkt für das SOAP Webservice in PDF-AS-WEB befindet sich unter „</w:t>
+      </w:r>
       <w:r>
         <w:rPr>
           <w:i/>
           <w:iCs/>
         </w:rPr>
-        <w:t>services</w:t>
-      </w:r>
-      <w:proofErr w:type="spellEnd"/>
-      <w:r>
-        <w:rPr>
-          <w:i/>
-          <w:iCs/>
-        </w:rPr>
-        <w:t>/</w:t>
-      </w:r>
-      <w:proofErr w:type="spellStart"/>
-      <w:r>
-        <w:rPr>
-          <w:i/>
-          <w:iCs/>
-        </w:rPr>
-        <w:t>wssign</w:t>
-      </w:r>
-      <w:proofErr w:type="spellEnd"/>
+        <w:t>services/wssign</w:t>
+      </w:r>
       <w:r>
         <w:t>“. Unter der URL „</w:t>
       </w:r>
-      <w:proofErr w:type="spellStart"/>
       <w:r>
         <w:rPr>
           <w:rFonts w:ascii="Century Gothic" w:eastAsia="Century Gothic" w:hAnsi="Century Gothic" w:cs="Century Gothic"/>
@@ -2749,31 +2474,12 @@
         </w:rPr>
         <w:t>services</w:t>
       </w:r>
-      <w:proofErr w:type="spellEnd"/>
       <w:r>
         <w:rPr>
           <w:i/>
           <w:iCs/>
         </w:rPr>
-        <w:t>/</w:t>
-      </w:r>
-      <w:proofErr w:type="spellStart"/>
-      <w:proofErr w:type="gramStart"/>
-      <w:r>
-        <w:rPr>
-          <w:i/>
-          <w:iCs/>
-        </w:rPr>
-        <w:t>wssign?wsdl</w:t>
-      </w:r>
-      <w:proofErr w:type="spellEnd"/>
-      <w:proofErr w:type="gramEnd"/>
-      <w:r>
-        <w:rPr>
-          <w:i/>
-          <w:iCs/>
-        </w:rPr>
-        <w:t xml:space="preserve">“ </w:t>
+        <w:t xml:space="preserve">/wssign?wsdl“ </w:t>
       </w:r>
       <w:r>
         <w:t>kann die Web Service Description abgefragt werden. Dieses WSDL dient als Dokumentation für das SOAP Service.</w:t>
@@ -2841,7 +2547,7 @@
                     </pic:cNvPicPr>
                   </pic:nvPicPr>
                   <pic:blipFill>
-                    <a:blip r:embed="rId14">
+                    <a:blip r:embed="rId15">
                       <a:extLst>
                         <a:ext uri="{28A0092B-C50C-407E-A947-70E740481C1C}">
                           <a14:useLocalDpi xmlns:a14="http://schemas.microsoft.com/office/drawing/2010/main" val="0"/>
@@ -2920,86 +2626,48 @@
     </w:p>
     <w:p>
       <w:r>
-        <w:t xml:space="preserve">Die externe Webanwendung startet den Signaturvorgang in dem ein SOAP Request an PDF-AS-WEB geschickt wird. Dieser Request enthält das zu signierende </w:t>
-      </w:r>
-      <w:proofErr w:type="gramStart"/>
-      <w:r>
-        <w:t>PDF Dokument</w:t>
-      </w:r>
-      <w:proofErr w:type="gramEnd"/>
-      <w:r>
-        <w:t xml:space="preserve">, </w:t>
+        <w:t xml:space="preserve">Die externe Webanwendung startet den Signaturvorgang in dem ein SOAP Request an PDF-AS-WEB geschickt wird. Dieser Request enthält das zu signierende PDF Dokument, </w:t>
       </w:r>
       <w:r>
         <w:lastRenderedPageBreak/>
         <w:t xml:space="preserve">sowie den zu verwendenden </w:t>
       </w:r>
-      <w:proofErr w:type="spellStart"/>
       <w:r>
         <w:rPr>
           <w:i/>
         </w:rPr>
         <w:t>connector</w:t>
       </w:r>
-      <w:proofErr w:type="spellEnd"/>
       <w:r>
         <w:t xml:space="preserve">, die </w:t>
       </w:r>
-      <w:proofErr w:type="spellStart"/>
       <w:r>
         <w:rPr>
           <w:i/>
         </w:rPr>
         <w:t>invoke-url</w:t>
       </w:r>
-      <w:proofErr w:type="spellEnd"/>
       <w:r>
         <w:t xml:space="preserve">, die </w:t>
       </w:r>
-      <w:proofErr w:type="spellStart"/>
       <w:r>
         <w:rPr>
           <w:i/>
         </w:rPr>
-        <w:t>invoke</w:t>
-      </w:r>
-      <w:proofErr w:type="spellEnd"/>
+        <w:t>invoke-error-url</w:t>
+      </w:r>
+      <w:r>
+        <w:t xml:space="preserve"> und die Signaturposition. </w:t>
+      </w:r>
+      <w:r>
+        <w:t xml:space="preserve">Also Antwort empfängt die Webanwendung eine URL. Der Benutzer muss an diese URL weitergeleitet werden damit PDF-AS-WEB eine Benutzerschnittstelle für die Bürgerkartenumgebung zur Verfügung hat. Nachdem das Dokument durch den Benutzer signiert wurde, kann dieser das PDF Dokument von PDF-AS-WEB herunterladen, bzw. falls eine </w:t>
+      </w:r>
       <w:r>
         <w:rPr>
           <w:i/>
         </w:rPr>
-        <w:t>-error-</w:t>
-      </w:r>
-      <w:proofErr w:type="spellStart"/>
-      <w:r>
-        <w:rPr>
-          <w:i/>
-        </w:rPr>
-        <w:t>url</w:t>
-      </w:r>
-      <w:proofErr w:type="spellEnd"/>
-      <w:r>
-        <w:t xml:space="preserve"> und die Signaturposition. </w:t>
-      </w:r>
-      <w:r>
-        <w:t xml:space="preserve">Also Antwort empfängt die Webanwendung eine URL. Der Benutzer muss an diese URL weitergeleitet werden damit PDF-AS-WEB eine Benutzerschnittstelle für die Bürgerkartenumgebung zur Verfügung hat. Nachdem das Dokument durch den Benutzer signiert wurde, kann dieser das </w:t>
-      </w:r>
-      <w:proofErr w:type="gramStart"/>
-      <w:r>
-        <w:t>PDF Dokument</w:t>
-      </w:r>
-      <w:proofErr w:type="gramEnd"/>
-      <w:r>
-        <w:t xml:space="preserve"> von PDF-AS-WEB herunterladen, bzw. falls eine </w:t>
-      </w:r>
-      <w:proofErr w:type="spellStart"/>
-      <w:r>
-        <w:rPr>
-          <w:i/>
-        </w:rPr>
         <w:t>invoke-url</w:t>
       </w:r>
-      <w:proofErr w:type="spellEnd"/>
       <w:r>
         <w:t xml:space="preserve"> definiert wurde, wird der Benutzer an diese URL weitergeleitet. Somit hat die Webanwendung die Möglichkeit das signierte Dokument von PDF-AS-WEB zu beziehen.</w:t>
       </w:r>
@@ -3034,31 +2702,7 @@
         <w:fldChar w:fldCharType="end"/>
       </w:r>
       <w:r>
-        <w:t xml:space="preserve"> verwendet um Serversignaturen zu erstellen. Der einzige Unterschied ist in diesem Fall, dass als Connector Parameter im SOAP Request „</w:t>
-      </w:r>
-      <w:proofErr w:type="spellStart"/>
-      <w:r>
-        <w:t>jks</w:t>
-      </w:r>
-      <w:proofErr w:type="spellEnd"/>
-      <w:r>
-        <w:t>“ oder „</w:t>
-      </w:r>
-      <w:proofErr w:type="spellStart"/>
-      <w:r>
-        <w:t>moa</w:t>
-      </w:r>
-      <w:proofErr w:type="spellEnd"/>
-      <w:r>
-        <w:t xml:space="preserve">“ angegeben werden müssen. PDF-AS-WEB verwendet dann einen Software </w:t>
-      </w:r>
-      <w:proofErr w:type="spellStart"/>
-      <w:r>
-        <w:t>Keystore</w:t>
-      </w:r>
-      <w:proofErr w:type="spellEnd"/>
-      <w:r>
-        <w:t>, bzw. eine MOA-SS Instanz im Hintergrund zur Erzeugung der Signatur.</w:t>
+        <w:t xml:space="preserve"> verwendet um Serversignaturen zu erstellen. Der einzige Unterschied ist in diesem Fall, dass als Connector Parameter im SOAP Request „jks“ oder „moa“ angegeben werden müssen. PDF-AS-WEB verwendet dann einen Software Keystore, bzw. eine MOA-SS Instanz im Hintergrund zur Erzeugung der Signatur.</w:t>
       </w:r>
     </w:p>
     <w:p>
@@ -3092,56 +2736,33 @@
         <w:pStyle w:val="Heading3"/>
       </w:pPr>
       <w:bookmarkStart w:id="11" w:name="_Toc396214456"/>
-      <w:proofErr w:type="spellStart"/>
-      <w:r>
-        <w:t>Sign</w:t>
-      </w:r>
-      <w:proofErr w:type="spellEnd"/>
-      <w:r>
-        <w:t xml:space="preserve"> Servlet</w:t>
+      <w:r>
+        <w:t>Sign Servlet</w:t>
       </w:r>
       <w:bookmarkEnd w:id="11"/>
     </w:p>
     <w:p>
       <w:r>
-        <w:t xml:space="preserve">Das </w:t>
-      </w:r>
-      <w:proofErr w:type="spellStart"/>
-      <w:r>
-        <w:t>Sign</w:t>
-      </w:r>
-      <w:proofErr w:type="spellEnd"/>
-      <w:r>
-        <w:t xml:space="preserve"> Servlet ist der Haupteinstiegspunkt in PDF-AS-WEB. Dieses Servlet kann entweder mittels GET oder POST Methode aufgerufen werden.</w:t>
+        <w:t>Das Sign Servlet ist der Haupteinstiegspunkt in PDF-AS-WEB. Dieses Servlet kann entweder mittels GET oder POST Methode aufgerufen werden.</w:t>
       </w:r>
       <w:r>
         <w:t xml:space="preserve"> Es muss entweder der </w:t>
       </w:r>
-      <w:proofErr w:type="spellStart"/>
       <w:r>
         <w:rPr>
           <w:b/>
         </w:rPr>
-        <w:t>pdf</w:t>
-      </w:r>
-      <w:proofErr w:type="spellEnd"/>
+        <w:t>pdf-file</w:t>
+      </w:r>
+      <w:r>
+        <w:t xml:space="preserve"> Parameter oder der </w:t>
+      </w:r>
       <w:r>
         <w:rPr>
           <w:b/>
         </w:rPr>
-        <w:t>-file</w:t>
-      </w:r>
-      <w:r>
-        <w:t xml:space="preserve"> Parameter oder der </w:t>
-      </w:r>
-      <w:proofErr w:type="spellStart"/>
-      <w:r>
-        <w:rPr>
-          <w:b/>
-        </w:rPr>
         <w:t>pdf-url</w:t>
       </w:r>
-      <w:proofErr w:type="spellEnd"/>
       <w:r>
         <w:t xml:space="preserve"> Parameter angegeben werden.</w:t>
       </w:r>
@@ -3157,14 +2778,12 @@
       <w:r>
         <w:t>„</w:t>
       </w:r>
-      <w:proofErr w:type="spellStart"/>
       <w:r>
         <w:rPr>
           <w:b/>
         </w:rPr>
         <w:t>connector</w:t>
       </w:r>
-      <w:proofErr w:type="spellEnd"/>
       <w:r>
         <w:t>“: Dieser Parame</w:t>
       </w:r>
@@ -3207,14 +2826,12 @@
       <w:r>
         <w:t>„</w:t>
       </w:r>
-      <w:proofErr w:type="spellStart"/>
       <w:r>
         <w:rPr>
           <w:b/>
         </w:rPr>
         <w:t>bku</w:t>
       </w:r>
-      <w:proofErr w:type="spellEnd"/>
       <w:r>
         <w:t>“: Es soll die lokale Bü</w:t>
       </w:r>
@@ -3233,14 +2850,12 @@
       <w:r>
         <w:t>„</w:t>
       </w:r>
-      <w:proofErr w:type="spellStart"/>
       <w:r>
         <w:rPr>
           <w:b/>
         </w:rPr>
         <w:t>onlinebku</w:t>
       </w:r>
-      <w:proofErr w:type="spellEnd"/>
       <w:r>
         <w:t xml:space="preserve">“: Es die MOCCA online als </w:t>
       </w:r>
@@ -3262,14 +2877,12 @@
       <w:r>
         <w:t>„</w:t>
       </w:r>
-      <w:proofErr w:type="spellStart"/>
       <w:r>
         <w:rPr>
           <w:b/>
         </w:rPr>
         <w:t>mobilebku</w:t>
       </w:r>
-      <w:proofErr w:type="spellEnd"/>
       <w:r>
         <w:t>“: Es soll die Handy Signatur verwendet werden.</w:t>
       </w:r>
@@ -3285,14 +2898,12 @@
       <w:r>
         <w:t>„</w:t>
       </w:r>
-      <w:proofErr w:type="spellStart"/>
       <w:r>
         <w:rPr>
           <w:b/>
         </w:rPr>
         <w:t>moa</w:t>
       </w:r>
-      <w:proofErr w:type="spellEnd"/>
       <w:r>
         <w:t>“: Es soll eine MOA-SS Instanz verwendet werden.</w:t>
       </w:r>
@@ -3308,24 +2919,14 @@
       <w:r>
         <w:t>„</w:t>
       </w:r>
-      <w:proofErr w:type="spellStart"/>
       <w:r>
         <w:rPr>
           <w:b/>
         </w:rPr>
         <w:t>jks</w:t>
       </w:r>
-      <w:proofErr w:type="spellEnd"/>
-      <w:r>
-        <w:t xml:space="preserve">“: Es soll ein </w:t>
-      </w:r>
-      <w:proofErr w:type="spellStart"/>
-      <w:r>
-        <w:t>Keystore</w:t>
-      </w:r>
-      <w:proofErr w:type="spellEnd"/>
-      <w:r>
-        <w:t xml:space="preserve"> verwendet werden.</w:t>
+      <w:r>
+        <w:t>“: Es soll ein Keystore verwendet werden.</w:t>
       </w:r>
     </w:p>
     <w:p>
@@ -3345,7 +2946,6 @@
         </w:rPr>
         <w:t>„</w:t>
       </w:r>
-      <w:proofErr w:type="spellStart"/>
       <w:r>
         <w:rPr>
           <w:b/>
@@ -3353,7 +2953,6 @@
         </w:rPr>
         <w:t>invoke-app-url</w:t>
       </w:r>
-      <w:proofErr w:type="spellEnd"/>
       <w:r>
         <w:rPr>
           <w:lang w:val="de-AT"/>
@@ -3366,13 +2965,8 @@
         </w:rPr>
         <w:t xml:space="preserve">e </w:t>
       </w:r>
-      <w:proofErr w:type="spellStart"/>
-      <w:r>
-        <w:t>Fertigstellungsurl</w:t>
-      </w:r>
-      <w:proofErr w:type="spellEnd"/>
-      <w:r>
-        <w:t xml:space="preserve"> der externen Webanwendung an. Der Benutzer wird nach Abschluss des Signaturvorgangs wieder auf diese URL umgeleitet.</w:t>
+      <w:r>
+        <w:t>Fertigstellungsurl der externen Webanwendung an. Der Benutzer wird nach Abschluss des Signaturvorgangs wieder auf diese URL umgeleitet.</w:t>
       </w:r>
       <w:r>
         <w:t xml:space="preserve"> (</w:t>
@@ -3404,47 +2998,13 @@
         </w:rPr>
         <w:t>„</w:t>
       </w:r>
-      <w:proofErr w:type="spellStart"/>
       <w:r>
         <w:rPr>
           <w:b/>
           <w:lang w:val="de-AT"/>
         </w:rPr>
-        <w:t>invoke</w:t>
-      </w:r>
-      <w:proofErr w:type="spellEnd"/>
-      <w:r>
-        <w:rPr>
-          <w:b/>
-          <w:lang w:val="de-AT"/>
-        </w:rPr>
-        <w:t>-</w:t>
-      </w:r>
-      <w:proofErr w:type="spellStart"/>
-      <w:r>
-        <w:rPr>
-          <w:b/>
-          <w:lang w:val="de-AT"/>
-        </w:rPr>
-        <w:t>app</w:t>
-      </w:r>
-      <w:proofErr w:type="spellEnd"/>
-      <w:r>
-        <w:rPr>
-          <w:b/>
-          <w:lang w:val="de-AT"/>
-        </w:rPr>
-        <w:t>-error-</w:t>
-      </w:r>
-      <w:proofErr w:type="spellStart"/>
-      <w:r>
-        <w:rPr>
-          <w:b/>
-          <w:lang w:val="de-AT"/>
-        </w:rPr>
-        <w:t>url</w:t>
-      </w:r>
-      <w:proofErr w:type="spellEnd"/>
+        <w:t>invoke-app-error-url</w:t>
+      </w:r>
       <w:r>
         <w:rPr>
           <w:lang w:val="de-AT"/>
@@ -3455,21 +3015,7 @@
         <w:rPr>
           <w:lang w:val="de-AT"/>
         </w:rPr>
-        <w:t xml:space="preserve">e </w:t>
-      </w:r>
-      <w:proofErr w:type="spellStart"/>
-      <w:r>
-        <w:rPr>
-          <w:lang w:val="de-AT"/>
-        </w:rPr>
-        <w:t>Fehlerurl</w:t>
-      </w:r>
-      <w:proofErr w:type="spellEnd"/>
-      <w:r>
-        <w:rPr>
-          <w:lang w:val="de-AT"/>
-        </w:rPr>
-        <w:t xml:space="preserve"> der externen Webanwendung an. Im Fehlerfall wird der Benutzer auf diese URL umgeleitet. </w:t>
+        <w:t xml:space="preserve">e Fehlerurl der externen Webanwendung an. Im Fehlerfall wird der Benutzer auf diese URL umgeleitet. </w:t>
       </w:r>
       <w:r>
         <w:t>(</w:t>
@@ -3501,7 +3047,6 @@
         </w:rPr>
         <w:t>„</w:t>
       </w:r>
-      <w:proofErr w:type="spellStart"/>
       <w:r>
         <w:rPr>
           <w:b/>
@@ -3509,7 +3054,6 @@
         </w:rPr>
         <w:t>locale</w:t>
       </w:r>
-      <w:proofErr w:type="spellEnd"/>
       <w:r>
         <w:rPr>
           <w:lang w:val="de-AT"/>
@@ -3526,41 +3070,13 @@
         <w:rPr>
           <w:lang w:val="de-AT"/>
         </w:rPr>
-        <w:t xml:space="preserve"> </w:t>
-      </w:r>
-      <w:proofErr w:type="spellStart"/>
-      <w:r>
-        <w:rPr>
-          <w:lang w:val="de-AT"/>
-        </w:rPr>
-        <w:t>Locale</w:t>
-      </w:r>
-      <w:proofErr w:type="spellEnd"/>
-      <w:r>
-        <w:rPr>
-          <w:lang w:val="de-AT"/>
-        </w:rPr>
-        <w:t xml:space="preserve"> die PDF-AS-WEB verwenden soll. Wird kein Parameter angegeben werden </w:t>
-      </w:r>
-      <w:r>
-        <w:rPr>
-          <w:lang w:val="de-AT"/>
-        </w:rPr>
-        <w:t xml:space="preserve">die </w:t>
-      </w:r>
-      <w:proofErr w:type="spellStart"/>
-      <w:r>
-        <w:rPr>
-          <w:lang w:val="de-AT"/>
-        </w:rPr>
-        <w:t>Locale</w:t>
-      </w:r>
-      <w:proofErr w:type="spellEnd"/>
-      <w:r>
-        <w:rPr>
-          <w:lang w:val="de-AT"/>
-        </w:rPr>
-        <w:t xml:space="preserve"> vom Benutzerbrowser ü</w:t>
+        <w:t xml:space="preserve"> Locale die PDF-AS-WEB verwenden soll. Wird kein Parameter angegeben werden </w:t>
+      </w:r>
+      <w:r>
+        <w:rPr>
+          <w:lang w:val="de-AT"/>
+        </w:rPr>
+        <w:t>die Locale vom Benutzerbrowser ü</w:t>
       </w:r>
       <w:r>
         <w:rPr>
@@ -3575,14 +3091,7 @@
         <w:rPr>
           <w:b/>
         </w:rPr>
-        <w:t xml:space="preserve">optionaler </w:t>
-      </w:r>
-      <w:proofErr w:type="gramStart"/>
-      <w:r>
-        <w:rPr>
-          <w:b/>
-        </w:rPr>
-        <w:t>Parameter</w:t>
+        <w:t>optionaler Parameter</w:t>
       </w:r>
       <w:r>
         <w:t>)</w:t>
@@ -3593,7 +3102,6 @@
         </w:rPr>
         <w:t>Mögliche</w:t>
       </w:r>
-      <w:proofErr w:type="gramEnd"/>
       <w:r>
         <w:rPr>
           <w:lang w:val="de-AT"/>
@@ -3660,21 +3168,12 @@
         </w:rPr>
         <w:t>„</w:t>
       </w:r>
-      <w:proofErr w:type="spellStart"/>
       <w:r>
         <w:rPr>
           <w:b/>
           <w:lang w:val="de-AT"/>
         </w:rPr>
-        <w:t>num</w:t>
-      </w:r>
-      <w:proofErr w:type="spellEnd"/>
-      <w:r>
-        <w:rPr>
-          <w:b/>
-          <w:lang w:val="de-AT"/>
-        </w:rPr>
-        <w:t>-bytes</w:t>
+        <w:t>num-bytes</w:t>
       </w:r>
       <w:r>
         <w:rPr>
@@ -3688,33 +3187,17 @@
         </w:rPr>
         <w:t xml:space="preserve"> Dieser Parameter gibt die Anzahl der Bytes des zu </w:t>
       </w:r>
-      <w:proofErr w:type="spellStart"/>
-      <w:r>
-        <w:rPr>
-          <w:lang w:val="de-AT"/>
-        </w:rPr>
-        <w:t>signiergenden</w:t>
-      </w:r>
-      <w:proofErr w:type="spellEnd"/>
-      <w:r>
-        <w:rPr>
-          <w:lang w:val="de-AT"/>
-        </w:rPr>
-        <w:t xml:space="preserve"> </w:t>
-      </w:r>
-      <w:proofErr w:type="gramStart"/>
-      <w:r>
-        <w:rPr>
-          <w:lang w:val="de-AT"/>
-        </w:rPr>
-        <w:t>PDF Dokuments</w:t>
-      </w:r>
-      <w:proofErr w:type="gramEnd"/>
-      <w:r>
-        <w:rPr>
-          <w:lang w:val="de-AT"/>
-        </w:rPr>
-        <w:t xml:space="preserve"> an. Wenn dieser Parameter angegeben wird, aber die Signaturdaten nicht entsprechen wird ein Fehler generiert. </w:t>
+      <w:r>
+        <w:rPr>
+          <w:lang w:val="de-AT"/>
+        </w:rPr>
+        <w:t>signierenden</w:t>
+      </w:r>
+      <w:r>
+        <w:rPr>
+          <w:lang w:val="de-AT"/>
+        </w:rPr>
+        <w:t xml:space="preserve"> PDF Dokuments an. Wenn dieser Parameter angegeben wird, aber die Signaturdaten nicht entsprechen wird ein Fehler generiert. </w:t>
       </w:r>
       <w:r>
         <w:t>(</w:t>
@@ -3746,48 +3229,37 @@
         </w:rPr>
         <w:t>„</w:t>
       </w:r>
-      <w:proofErr w:type="spellStart"/>
       <w:r>
         <w:rPr>
           <w:b/>
           <w:lang w:val="de-AT"/>
         </w:rPr>
-        <w:t>sig</w:t>
-      </w:r>
-      <w:proofErr w:type="spellEnd"/>
+        <w:t>sig-</w:t>
+      </w:r>
       <w:r>
         <w:rPr>
           <w:b/>
           <w:lang w:val="de-AT"/>
         </w:rPr>
-        <w:t>-</w:t>
-      </w:r>
-      <w:r>
-        <w:rPr>
-          <w:b/>
-          <w:lang w:val="de-AT"/>
-        </w:rPr>
         <w:t>type</w:t>
       </w:r>
       <w:r>
         <w:rPr>
           <w:lang w:val="de-AT"/>
         </w:rPr>
-        <w:t xml:space="preserve">“: Dieser Parameter gibt das zu verwendete Signaturprofil von PDF-AS an. Wird dieser Parameter nicht </w:t>
-      </w:r>
-      <w:proofErr w:type="spellStart"/>
-      <w:r>
-        <w:rPr>
-          <w:lang w:val="de-AT"/>
-        </w:rPr>
-        <w:t>angegen</w:t>
-      </w:r>
-      <w:proofErr w:type="spellEnd"/>
-      <w:r>
-        <w:rPr>
-          <w:lang w:val="de-AT"/>
-        </w:rPr>
-        <w:t>, wird das Standardsignaturprofil</w:t>
+        <w:t>“: Dieser Parameter gibt das zu verwendete Signaturprofil von PDF-AS an. Wird dieser Parameter nicht angege</w:t>
+      </w:r>
+      <w:r>
+        <w:rPr>
+          <w:lang w:val="de-AT"/>
+        </w:rPr>
+        <w:t>be</w:t>
+      </w:r>
+      <w:r>
+        <w:rPr>
+          <w:lang w:val="de-AT"/>
+        </w:rPr>
+        <w:t>n, wird das Standardsignaturprofil</w:t>
       </w:r>
       <w:r>
         <w:rPr>
@@ -3997,62 +3469,25 @@
         </w:rPr>
         <w:t>„</w:t>
       </w:r>
-      <w:proofErr w:type="spellStart"/>
       <w:r>
         <w:rPr>
           <w:b/>
           <w:lang w:val="de-AT"/>
         </w:rPr>
-        <w:t>pdf</w:t>
-      </w:r>
-      <w:proofErr w:type="spellEnd"/>
+        <w:t>pdf-f</w:t>
+      </w:r>
       <w:r>
         <w:rPr>
           <w:b/>
           <w:lang w:val="de-AT"/>
         </w:rPr>
-        <w:t>-f</w:t>
-      </w:r>
-      <w:r>
-        <w:rPr>
-          <w:b/>
-          <w:lang w:val="de-AT"/>
-        </w:rPr>
         <w:t>ile</w:t>
       </w:r>
       <w:r>
         <w:rPr>
           <w:lang w:val="de-AT"/>
         </w:rPr>
-        <w:t xml:space="preserve">“: Dieser Parameter gibt den File Parameter an beim </w:t>
-      </w:r>
-      <w:proofErr w:type="spellStart"/>
-      <w:r>
-        <w:rPr>
-          <w:lang w:val="de-AT"/>
-        </w:rPr>
-        <w:t>upload</w:t>
-      </w:r>
-      <w:proofErr w:type="spellEnd"/>
-      <w:r>
-        <w:rPr>
-          <w:lang w:val="de-AT"/>
-        </w:rPr>
-        <w:t xml:space="preserve"> des </w:t>
-      </w:r>
-      <w:proofErr w:type="gramStart"/>
-      <w:r>
-        <w:rPr>
-          <w:lang w:val="de-AT"/>
-        </w:rPr>
-        <w:t>PDF Dokuments</w:t>
-      </w:r>
-      <w:proofErr w:type="gramEnd"/>
-      <w:r>
-        <w:rPr>
-          <w:lang w:val="de-AT"/>
-        </w:rPr>
-        <w:t xml:space="preserve"> mittels POST Methode. </w:t>
+        <w:t xml:space="preserve">“: Dieser Parameter gibt den File Parameter an beim upload des PDF Dokuments mittels POST Methode. </w:t>
       </w:r>
       <w:r>
         <w:t>(</w:t>
@@ -4084,7 +3519,6 @@
         </w:rPr>
         <w:t>„</w:t>
       </w:r>
-      <w:proofErr w:type="spellStart"/>
       <w:r>
         <w:rPr>
           <w:b/>
@@ -4092,26 +3526,11 @@
         </w:rPr>
         <w:t>pdf-url</w:t>
       </w:r>
-      <w:proofErr w:type="spellEnd"/>
-      <w:r>
-        <w:rPr>
-          <w:lang w:val="de-AT"/>
-        </w:rPr>
-        <w:t xml:space="preserve">“: Dieser Parameter gibt die URL an, von der das zu signierende </w:t>
-      </w:r>
-      <w:proofErr w:type="gramStart"/>
-      <w:r>
-        <w:rPr>
-          <w:lang w:val="de-AT"/>
-        </w:rPr>
-        <w:t>PDF Dokument</w:t>
-      </w:r>
-      <w:proofErr w:type="gramEnd"/>
-      <w:r>
-        <w:rPr>
-          <w:lang w:val="de-AT"/>
-        </w:rPr>
-        <w:t xml:space="preserve"> heruntergeladen werden soll. </w:t>
+      <w:r>
+        <w:rPr>
+          <w:lang w:val="de-AT"/>
+        </w:rPr>
+        <w:t xml:space="preserve">“: Dieser Parameter gibt die URL an, von der das zu signierende PDF Dokument heruntergeladen werden soll. </w:t>
       </w:r>
       <w:r>
         <w:t>(</w:t>
@@ -4140,33 +3559,11 @@
       <w:r>
         <w:t>„</w:t>
       </w:r>
-      <w:proofErr w:type="spellStart"/>
       <w:r>
         <w:rPr>
           <w:b/>
         </w:rPr>
-        <w:t>sig</w:t>
-      </w:r>
-      <w:proofErr w:type="spellEnd"/>
-      <w:r>
-        <w:rPr>
-          <w:b/>
-        </w:rPr>
-        <w:t>-</w:t>
-      </w:r>
-      <w:proofErr w:type="spellStart"/>
-      <w:r>
-        <w:rPr>
-          <w:b/>
-        </w:rPr>
-        <w:t>pos</w:t>
-      </w:r>
-      <w:proofErr w:type="spellEnd"/>
-      <w:r>
-        <w:rPr>
-          <w:b/>
-        </w:rPr>
-        <w:t>-p</w:t>
+        <w:t>sig-pos-p</w:t>
       </w:r>
       <w:r>
         <w:t xml:space="preserve">“: Mit diesem Parameter kann die </w:t>
@@ -4201,33 +3598,11 @@
       <w:r>
         <w:t>„</w:t>
       </w:r>
-      <w:proofErr w:type="spellStart"/>
       <w:r>
         <w:rPr>
           <w:b/>
         </w:rPr>
-        <w:t>sig</w:t>
-      </w:r>
-      <w:proofErr w:type="spellEnd"/>
-      <w:r>
-        <w:rPr>
-          <w:b/>
-        </w:rPr>
-        <w:t>-</w:t>
-      </w:r>
-      <w:proofErr w:type="spellStart"/>
-      <w:r>
-        <w:rPr>
-          <w:b/>
-        </w:rPr>
-        <w:t>pos</w:t>
-      </w:r>
-      <w:proofErr w:type="spellEnd"/>
-      <w:r>
-        <w:rPr>
-          <w:b/>
-        </w:rPr>
-        <w:t>-w</w:t>
+        <w:t>sig-pos-w</w:t>
       </w:r>
       <w:r>
         <w:t>“:</w:t>
@@ -4262,33 +3637,11 @@
       <w:r>
         <w:t>„</w:t>
       </w:r>
-      <w:proofErr w:type="spellStart"/>
       <w:r>
         <w:rPr>
           <w:b/>
         </w:rPr>
-        <w:t>sig</w:t>
-      </w:r>
-      <w:proofErr w:type="spellEnd"/>
-      <w:r>
-        <w:rPr>
-          <w:b/>
-        </w:rPr>
-        <w:t>-</w:t>
-      </w:r>
-      <w:proofErr w:type="spellStart"/>
-      <w:r>
-        <w:rPr>
-          <w:b/>
-        </w:rPr>
-        <w:t>pos</w:t>
-      </w:r>
-      <w:proofErr w:type="spellEnd"/>
-      <w:r>
-        <w:rPr>
-          <w:b/>
-        </w:rPr>
-        <w:t>-x</w:t>
+        <w:t>sig-pos-x</w:t>
       </w:r>
       <w:r>
         <w:t>“:</w:t>
@@ -4323,33 +3676,11 @@
       <w:r>
         <w:t>„</w:t>
       </w:r>
-      <w:proofErr w:type="spellStart"/>
       <w:r>
         <w:rPr>
           <w:b/>
         </w:rPr>
-        <w:t>sig</w:t>
-      </w:r>
-      <w:proofErr w:type="spellEnd"/>
-      <w:r>
-        <w:rPr>
-          <w:b/>
-        </w:rPr>
-        <w:t>-</w:t>
-      </w:r>
-      <w:proofErr w:type="spellStart"/>
-      <w:r>
-        <w:rPr>
-          <w:b/>
-        </w:rPr>
-        <w:t>pos</w:t>
-      </w:r>
-      <w:proofErr w:type="spellEnd"/>
-      <w:r>
-        <w:rPr>
-          <w:b/>
-        </w:rPr>
-        <w:t>-y</w:t>
+        <w:t>sig-pos-y</w:t>
       </w:r>
       <w:r>
         <w:t>“:</w:t>
@@ -4384,33 +3715,11 @@
       <w:r>
         <w:t>„</w:t>
       </w:r>
-      <w:proofErr w:type="spellStart"/>
       <w:r>
         <w:rPr>
           <w:b/>
         </w:rPr>
-        <w:t>sig</w:t>
-      </w:r>
-      <w:proofErr w:type="spellEnd"/>
-      <w:r>
-        <w:rPr>
-          <w:b/>
-        </w:rPr>
-        <w:t>-</w:t>
-      </w:r>
-      <w:proofErr w:type="spellStart"/>
-      <w:r>
-        <w:rPr>
-          <w:b/>
-        </w:rPr>
-        <w:t>pos</w:t>
-      </w:r>
-      <w:proofErr w:type="spellEnd"/>
-      <w:r>
-        <w:rPr>
-          <w:b/>
-        </w:rPr>
-        <w:t>-r</w:t>
+        <w:t>sig-pos-r</w:t>
       </w:r>
       <w:r>
         <w:t>“: Mit diesem Parameter kann die Rotation (in Grad) des Signaturblocks festgelegt werden.  (</w:t>
@@ -4439,44 +3748,20 @@
       <w:r>
         <w:t>„</w:t>
       </w:r>
-      <w:proofErr w:type="spellStart"/>
       <w:r>
         <w:rPr>
           <w:b/>
         </w:rPr>
-        <w:t>sig</w:t>
-      </w:r>
-      <w:proofErr w:type="spellEnd"/>
-      <w:r>
-        <w:rPr>
-          <w:b/>
-        </w:rPr>
-        <w:t>-</w:t>
-      </w:r>
-      <w:proofErr w:type="spellStart"/>
-      <w:r>
-        <w:rPr>
-          <w:b/>
-        </w:rPr>
-        <w:t>pos</w:t>
-      </w:r>
-      <w:proofErr w:type="spellEnd"/>
-      <w:r>
-        <w:rPr>
-          <w:b/>
-        </w:rPr>
-        <w:t>-f</w:t>
-      </w:r>
-      <w:r>
-        <w:t xml:space="preserve">“: Mit diesem Parameter kann die </w:t>
-      </w:r>
-      <w:proofErr w:type="spellStart"/>
-      <w:r>
-        <w:t>Footerhoehe</w:t>
-      </w:r>
-      <w:proofErr w:type="spellEnd"/>
-      <w:r>
-        <w:t xml:space="preserve"> bei automatischer Platzierung des Signaturblocks vorgegeben werden.  (</w:t>
+        <w:t>sig-pos-f</w:t>
+      </w:r>
+      <w:r>
+        <w:t>“: Mit diesem Parameter kann die Footerh</w:t>
+      </w:r>
+      <w:r>
+        <w:t>ö</w:t>
+      </w:r>
+      <w:r>
+        <w:t>he bei automatischer Platzierung des Signaturblocks vorgegeben werden.  (</w:t>
       </w:r>
       <w:r>
         <w:rPr>
@@ -4502,69 +3787,23 @@
       <w:r>
         <w:t>„</w:t>
       </w:r>
-      <w:proofErr w:type="spellStart"/>
       <w:r>
         <w:rPr>
           <w:b/>
         </w:rPr>
-        <w:t>invoke</w:t>
-      </w:r>
-      <w:proofErr w:type="spellEnd"/>
+        <w:t>invoke-app-url-target</w:t>
+      </w:r>
+      <w:r>
+        <w:t>“: Mit diesem Parameter lässt sich der Frame festlegen in dem der Benutzer nach Abschluss des Signaturvorgangs an die „</w:t>
+      </w:r>
       <w:r>
         <w:rPr>
           <w:b/>
         </w:rPr>
-        <w:t>-</w:t>
-      </w:r>
-      <w:proofErr w:type="spellStart"/>
-      <w:r>
-        <w:rPr>
-          <w:b/>
-        </w:rPr>
-        <w:t>app</w:t>
-      </w:r>
-      <w:proofErr w:type="spellEnd"/>
-      <w:r>
-        <w:rPr>
-          <w:b/>
-        </w:rPr>
-        <w:t>-</w:t>
-      </w:r>
-      <w:proofErr w:type="spellStart"/>
-      <w:r>
-        <w:rPr>
-          <w:b/>
-        </w:rPr>
-        <w:t>url</w:t>
-      </w:r>
-      <w:proofErr w:type="spellEnd"/>
-      <w:r>
-        <w:rPr>
-          <w:b/>
-        </w:rPr>
-        <w:t>-target</w:t>
-      </w:r>
-      <w:r>
-        <w:t>“: Mit diesem Parameter lässt sich der Frame festlegen in dem der Benutzer nach Abschluss des Signaturvorgangs an die „</w:t>
-      </w:r>
-      <w:proofErr w:type="spellStart"/>
-      <w:r>
-        <w:rPr>
-          <w:b/>
-        </w:rPr>
         <w:t>invoke-app-url</w:t>
       </w:r>
-      <w:proofErr w:type="spellEnd"/>
-      <w:r>
-        <w:t xml:space="preserve">“ umgeleitet wird. Dieser Parameter wird als </w:t>
-      </w:r>
-      <w:proofErr w:type="spellStart"/>
-      <w:r>
-        <w:t>target</w:t>
-      </w:r>
-      <w:proofErr w:type="spellEnd"/>
-      <w:r>
-        <w:t xml:space="preserve"> Attribute eines HTML Formulars eingetragen. Daher sind alle Werte gültig die für dieses Attribut gültig sind. Mögliche Werte für dieses Attribut sind:</w:t>
+      <w:r>
+        <w:t>“ umgeleitet wird. Dieser Parameter wird als target Attribute eines HTML Formulars eingetragen. Daher sind alle Werte gültig die für dieses Attribut gültig sind. Mögliche Werte für dieses Attribut sind:</w:t>
       </w:r>
     </w:p>
     <w:p>
@@ -4591,14 +3830,12 @@
       <w:r>
         <w:t>„</w:t>
       </w:r>
-      <w:proofErr w:type="spellStart"/>
       <w:r>
         <w:rPr>
           <w:b/>
         </w:rPr>
         <w:t>invoke-app-url</w:t>
       </w:r>
-      <w:proofErr w:type="spellEnd"/>
       <w:r>
         <w:rPr>
           <w:b/>
@@ -4606,15 +3843,7 @@
         <w:t xml:space="preserve">“ </w:t>
       </w:r>
       <w:r>
-        <w:t xml:space="preserve">wird in einem neuen Fenster oder </w:t>
-      </w:r>
-      <w:proofErr w:type="spellStart"/>
-      <w:r>
-        <w:t>Tap</w:t>
-      </w:r>
-      <w:proofErr w:type="spellEnd"/>
-      <w:r>
-        <w:t xml:space="preserve"> geöffnet.</w:t>
+        <w:t>wird in einem neuen Fenster oder Tap geöffnet.</w:t>
       </w:r>
     </w:p>
     <w:p>
@@ -4629,16 +3858,8 @@
         <w:rPr>
           <w:i/>
         </w:rPr>
-        <w:t>_</w:t>
-      </w:r>
-      <w:proofErr w:type="spellStart"/>
-      <w:r>
-        <w:rPr>
-          <w:i/>
-        </w:rPr>
-        <w:t>self</w:t>
-      </w:r>
-      <w:proofErr w:type="spellEnd"/>
+        <w:t>_self</w:t>
+      </w:r>
       <w:r>
         <w:t xml:space="preserve">: </w:t>
       </w:r>
@@ -4652,14 +3873,12 @@
       <w:r>
         <w:t>„</w:t>
       </w:r>
-      <w:proofErr w:type="spellStart"/>
       <w:r>
         <w:rPr>
           <w:b/>
         </w:rPr>
         <w:t>invoke-app-url</w:t>
       </w:r>
-      <w:proofErr w:type="spellEnd"/>
       <w:r>
         <w:rPr>
           <w:b/>
@@ -4685,16 +3904,8 @@
         <w:rPr>
           <w:i/>
         </w:rPr>
-        <w:t>_</w:t>
-      </w:r>
-      <w:proofErr w:type="spellStart"/>
-      <w:r>
-        <w:rPr>
-          <w:i/>
-        </w:rPr>
-        <w:t>parent</w:t>
-      </w:r>
-      <w:proofErr w:type="spellEnd"/>
+        <w:t>_parent</w:t>
+      </w:r>
       <w:r>
         <w:t>:</w:t>
       </w:r>
@@ -4705,14 +3916,12 @@
       <w:r>
         <w:t>„</w:t>
       </w:r>
-      <w:proofErr w:type="spellStart"/>
       <w:r>
         <w:rPr>
           <w:b/>
         </w:rPr>
         <w:t>invoke-app-url</w:t>
       </w:r>
-      <w:proofErr w:type="spellEnd"/>
       <w:r>
         <w:rPr>
           <w:b/>
@@ -4723,21 +3932,8 @@
         <w:t>wird im</w:t>
       </w:r>
       <w:r>
-        <w:t xml:space="preserve"> </w:t>
-      </w:r>
-      <w:proofErr w:type="spellStart"/>
-      <w:r>
-        <w:t>parent</w:t>
-      </w:r>
-      <w:proofErr w:type="spellEnd"/>
-      <w:r>
-        <w:t xml:space="preserve"> </w:t>
-      </w:r>
-      <w:proofErr w:type="spellStart"/>
-      <w:r>
-        <w:t>frame</w:t>
-      </w:r>
-      <w:proofErr w:type="spellEnd"/>
+        <w:t xml:space="preserve"> parent frame</w:t>
+      </w:r>
       <w:r>
         <w:t xml:space="preserve"> geöffnet.</w:t>
       </w:r>
@@ -4771,14 +3967,12 @@
       <w:r>
         <w:t>„</w:t>
       </w:r>
-      <w:proofErr w:type="spellStart"/>
       <w:r>
         <w:rPr>
           <w:b/>
         </w:rPr>
         <w:t>invoke-app-url</w:t>
       </w:r>
-      <w:proofErr w:type="spellEnd"/>
       <w:r>
         <w:rPr>
           <w:b/>
@@ -4815,14 +4009,12 @@
       <w:r>
         <w:t>„</w:t>
       </w:r>
-      <w:proofErr w:type="spellStart"/>
       <w:r>
         <w:rPr>
           <w:b/>
         </w:rPr>
         <w:t>invoke-app-url</w:t>
       </w:r>
-      <w:proofErr w:type="spellEnd"/>
       <w:r>
         <w:rPr>
           <w:b/>
@@ -4830,15 +4022,7 @@
         <w:t xml:space="preserve">“ </w:t>
       </w:r>
       <w:r>
-        <w:t xml:space="preserve">wird in einem benannten </w:t>
-      </w:r>
-      <w:proofErr w:type="spellStart"/>
-      <w:r>
-        <w:t>iframe</w:t>
-      </w:r>
-      <w:proofErr w:type="spellEnd"/>
-      <w:r>
-        <w:t xml:space="preserve"> angezeigt.</w:t>
+        <w:t>wird in einem benannten iframe angezeigt.</w:t>
       </w:r>
     </w:p>
     <w:p>
@@ -4852,19 +4036,11 @@
       <w:r>
         <w:t>„</w:t>
       </w:r>
-      <w:proofErr w:type="spellStart"/>
       <w:r>
         <w:rPr>
           <w:b/>
         </w:rPr>
-        <w:t>verify</w:t>
-      </w:r>
-      <w:proofErr w:type="spellEnd"/>
-      <w:r>
-        <w:rPr>
-          <w:b/>
-        </w:rPr>
-        <w:t>-level</w:t>
+        <w:t>verify-level</w:t>
       </w:r>
       <w:r>
         <w:t>“: Mit diesem Parameter lässt sich festlegen, welche Art von Signaturverifikation nach dem Signaturvorgang durchgeführt werden soll.</w:t>
@@ -4881,14 +4057,12 @@
       <w:r>
         <w:t>„</w:t>
       </w:r>
-      <w:proofErr w:type="spellStart"/>
       <w:r>
         <w:rPr>
           <w:i/>
         </w:rPr>
         <w:t>full</w:t>
       </w:r>
-      <w:proofErr w:type="spellEnd"/>
       <w:r>
         <w:t>“:</w:t>
       </w:r>
@@ -4912,14 +4086,12 @@
         <w:lastRenderedPageBreak/>
         <w:t>„</w:t>
       </w:r>
-      <w:proofErr w:type="spellStart"/>
       <w:r>
         <w:rPr>
           <w:i/>
         </w:rPr>
         <w:t>intOnly</w:t>
       </w:r>
-      <w:proofErr w:type="spellEnd"/>
       <w:r>
         <w:t>“:</w:t>
       </w:r>
@@ -4942,14 +4114,12 @@
       <w:r>
         <w:t>„</w:t>
       </w:r>
-      <w:proofErr w:type="spellStart"/>
       <w:r>
         <w:rPr>
           <w:b/>
         </w:rPr>
         <w:t>filename</w:t>
       </w:r>
-      <w:proofErr w:type="spellEnd"/>
       <w:r>
         <w:t>“:</w:t>
       </w:r>
@@ -4980,14 +4150,12 @@
       <w:r>
         <w:t>„</w:t>
       </w:r>
-      <w:proofErr w:type="spellStart"/>
       <w:r>
         <w:rPr>
           <w:b/>
         </w:rPr>
         <w:t>qrcontent</w:t>
       </w:r>
-      <w:proofErr w:type="spellEnd"/>
       <w:r>
         <w:t>“: Mit diesem Parameter lässt sich ein Text übergeben, welcher von als QR Code als Signaturmarke verwendet werden soll. (</w:t>
       </w:r>
@@ -5022,53 +4190,19 @@
         <w:t>pp:</w:t>
       </w:r>
       <w:r>
-        <w:t xml:space="preserve">“: Dies ist ein </w:t>
-      </w:r>
-      <w:proofErr w:type="spellStart"/>
-      <w:r>
-        <w:t>Prefix</w:t>
-      </w:r>
-      <w:proofErr w:type="spellEnd"/>
-      <w:r>
-        <w:t xml:space="preserve"> fü</w:t>
-      </w:r>
-      <w:r>
-        <w:t xml:space="preserve">r </w:t>
-      </w:r>
-      <w:proofErr w:type="spellStart"/>
-      <w:r>
-        <w:t>Preprocessor</w:t>
-      </w:r>
-      <w:proofErr w:type="spellEnd"/>
-      <w:r>
-        <w:t xml:space="preserve"> Argumente. Soll beispielsweise das</w:t>
-      </w:r>
-      <w:r>
-        <w:t xml:space="preserve"> Argument „</w:t>
-      </w:r>
-      <w:proofErr w:type="spellStart"/>
-      <w:r>
-        <w:t>testid</w:t>
-      </w:r>
-      <w:proofErr w:type="spellEnd"/>
-      <w:r>
-        <w:t>“ übergeben werden</w:t>
+        <w:t>“: Dies ist ein Prefix fü</w:t>
+      </w:r>
+      <w:r>
+        <w:t>r Preprocessor Argumente. Soll beispielsweise das</w:t>
+      </w:r>
+      <w:r>
+        <w:t xml:space="preserve"> Argument „testid“ übergeben werden</w:t>
       </w:r>
       <w:r>
         <w:t>,</w:t>
       </w:r>
       <w:r>
-        <w:t xml:space="preserve"> so kann ein Parameter „</w:t>
-      </w:r>
-      <w:proofErr w:type="spellStart"/>
-      <w:proofErr w:type="gramStart"/>
-      <w:r>
-        <w:t>pp:testid</w:t>
-      </w:r>
-      <w:proofErr w:type="spellEnd"/>
-      <w:proofErr w:type="gramEnd"/>
-      <w:r>
-        <w:t>“ verwendet werden. (</w:t>
+        <w:t xml:space="preserve"> so kann ein Parameter „pp:testid“ verwendet werden. (</w:t>
       </w:r>
       <w:r>
         <w:rPr>
@@ -5094,54 +4228,20 @@
       <w:r>
         <w:t>„</w:t>
       </w:r>
-      <w:proofErr w:type="spellStart"/>
       <w:r>
         <w:rPr>
           <w:b/>
         </w:rPr>
-        <w:t>ov</w:t>
-      </w:r>
-      <w:proofErr w:type="spellEnd"/>
-      <w:r>
-        <w:rPr>
-          <w:b/>
-        </w:rPr>
-        <w:t>:</w:t>
-      </w:r>
-      <w:r>
-        <w:t xml:space="preserve">“: Dies ist ein </w:t>
-      </w:r>
-      <w:proofErr w:type="spellStart"/>
-      <w:r>
-        <w:t>Prefix</w:t>
-      </w:r>
-      <w:proofErr w:type="spellEnd"/>
-      <w:r>
-        <w:t xml:space="preserve"> für das Überschreiben von K</w:t>
+        <w:t>ov:</w:t>
+      </w:r>
+      <w:r>
+        <w:t>“: Dies ist ein Prefix für das Überschreiben von K</w:t>
       </w:r>
       <w:r>
         <w:t>onfigurationseinstellung. Soll beispielsweise das</w:t>
       </w:r>
       <w:r>
-        <w:t xml:space="preserve"> Argument „</w:t>
-      </w:r>
-      <w:proofErr w:type="spellStart"/>
-      <w:r>
-        <w:t>testid</w:t>
-      </w:r>
-      <w:proofErr w:type="spellEnd"/>
-      <w:r>
-        <w:t>“ übergeben werden so kann ein Parameter „</w:t>
-      </w:r>
-      <w:proofErr w:type="spellStart"/>
-      <w:proofErr w:type="gramStart"/>
-      <w:r>
-        <w:t>ov:testid</w:t>
-      </w:r>
-      <w:proofErr w:type="spellEnd"/>
-      <w:proofErr w:type="gramEnd"/>
-      <w:r>
-        <w:t>“ verwendet werden. (</w:t>
+        <w:t xml:space="preserve"> Argument „testid“ übergeben werden so kann ein Parameter „ov:testid“ verwendet werden. (</w:t>
       </w:r>
       <w:r>
         <w:rPr>
@@ -5170,7 +4270,6 @@
         </w:rPr>
         <w:t>„</w:t>
       </w:r>
-      <w:proofErr w:type="spellStart"/>
       <w:r>
         <w:rPr>
           <w:b/>
@@ -5179,55 +4278,78 @@
         </w:rPr>
         <w:t>sbp</w:t>
       </w:r>
-      <w:proofErr w:type="spellEnd"/>
-      <w:r>
-        <w:rPr>
-          <w:lang w:val="de-AT"/>
-        </w:rPr>
-        <w:t>“: Mit diesem Parameter können dynamische Signaturblockparameter übergeben werden. Es muss</w:t>
-      </w:r>
-      <w:r>
-        <w:rPr>
-          <w:lang w:val="de-AT"/>
-        </w:rPr>
+      <w:r>
+        <w:rPr>
+          <w:b/>
+          <w:bCs/>
+          <w:lang w:val="de-AT"/>
+        </w:rPr>
+        <w:t>:</w:t>
+      </w:r>
+      <w:r>
+        <w:rPr>
+          <w:lang w:val="de-AT"/>
+        </w:rPr>
+        <w:t xml:space="preserve">“: Mit diesem Parameter können dynamische Signaturblockparameter übergeben werden. </w:t>
+      </w:r>
+      <w:r>
+        <w:rPr>
+          <w:lang w:val="de-AT"/>
+        </w:rPr>
+        <w:t>Es muss sich dabei um Key-Value Paare handeln, die in der Form „sbp:key</w:t>
+      </w:r>
+      <w:r>
+        <w:rPr>
+          <w:lang w:val="de-AT"/>
+        </w:rPr>
+        <w:t>A</w:t>
+      </w:r>
+      <w:r>
+        <w:rPr>
+          <w:lang w:val="de-AT"/>
+        </w:rPr>
+        <w:t>=value</w:t>
+      </w:r>
+      <w:r>
+        <w:rPr>
+          <w:lang w:val="de-AT"/>
+        </w:rPr>
+        <w:t>A</w:t>
+      </w:r>
+      <w:r>
+        <w:rPr>
+          <w:lang w:val="de-AT"/>
+        </w:rPr>
+        <w:t>“ bzw. „sbp:key</w:t>
+      </w:r>
+      <w:r>
+        <w:rPr>
+          <w:lang w:val="de-AT"/>
+        </w:rPr>
+        <w:t>B</w:t>
+      </w:r>
+      <w:r>
+        <w:rPr>
+          <w:lang w:val="de-AT"/>
+        </w:rPr>
+        <w:t>=value</w:t>
+      </w:r>
+      <w:r>
+        <w:rPr>
+          <w:lang w:val="de-AT"/>
+        </w:rPr>
+        <w:t>B</w:t>
+      </w:r>
+      <w:r>
+        <w:rPr>
+          <w:lang w:val="de-AT"/>
+        </w:rPr>
+        <w:t>“ übergeben werden.</w:t>
+      </w:r>
+      <w:r>
         <w:t xml:space="preserve"> </w:t>
       </w:r>
       <w:r>
-        <w:rPr>
-          <w:lang w:val="de-AT"/>
-        </w:rPr>
-        <w:t>s</w:t>
-      </w:r>
-      <w:r>
-        <w:rPr>
-          <w:lang w:val="de-AT"/>
-        </w:rPr>
-        <w:t>ic</w:t>
-      </w:r>
-      <w:r>
-        <w:rPr>
-          <w:lang w:val="de-AT"/>
-        </w:rPr>
-        <w:t>h dabei um Key-Value Paare handeln, die durch einen Strichpunkt getrennt sind. Beispielsweise „key1=value</w:t>
-      </w:r>
-      <w:proofErr w:type="gramStart"/>
-      <w:r>
-        <w:rPr>
-          <w:lang w:val="de-AT"/>
-        </w:rPr>
-        <w:t>1;key</w:t>
-      </w:r>
-      <w:proofErr w:type="gramEnd"/>
-      <w:r>
-        <w:rPr>
-          <w:lang w:val="de-AT"/>
-        </w:rPr>
-        <w:t>2=value2“.</w:t>
-      </w:r>
-      <w:r>
-        <w:t xml:space="preserve"> </w:t>
-      </w:r>
-      <w:r>
         <w:t>(</w:t>
       </w:r>
       <w:r>
@@ -5253,63 +4375,30 @@
         <w:pStyle w:val="Heading3"/>
       </w:pPr>
       <w:bookmarkStart w:id="12" w:name="_Toc396214457"/>
-      <w:proofErr w:type="spellStart"/>
-      <w:r>
-        <w:t>ProvidePDF</w:t>
-      </w:r>
-      <w:proofErr w:type="spellEnd"/>
-      <w:r>
-        <w:t xml:space="preserve"> Servlet</w:t>
+      <w:r>
+        <w:t>ProvidePDF Servlet</w:t>
       </w:r>
       <w:bookmarkEnd w:id="12"/>
     </w:p>
     <w:p>
       <w:r>
-        <w:t xml:space="preserve">Das </w:t>
-      </w:r>
-      <w:proofErr w:type="spellStart"/>
-      <w:r>
-        <w:t>Provide</w:t>
-      </w:r>
-      <w:proofErr w:type="spellEnd"/>
-      <w:r>
-        <w:t xml:space="preserve"> </w:t>
-      </w:r>
-      <w:proofErr w:type="gramStart"/>
-      <w:r>
-        <w:t>PDF Servlet</w:t>
-      </w:r>
-      <w:proofErr w:type="gramEnd"/>
-      <w:r>
-        <w:t xml:space="preserve"> </w:t>
-      </w:r>
-      <w:proofErr w:type="spellStart"/>
-      <w:r>
-        <w:t>laesst</w:t>
-      </w:r>
-      <w:proofErr w:type="spellEnd"/>
+        <w:t xml:space="preserve">Das Provide PDF Servlet </w:t>
+      </w:r>
+      <w:r>
+        <w:t>lässt</w:t>
+      </w:r>
       <w:r>
         <w:t xml:space="preserve"> keine Parameter zu. Das Verhalten wird durch die Parameter gesteuert, die beim Aufruf </w:t>
       </w:r>
       <w:r>
-        <w:t xml:space="preserve">des </w:t>
-      </w:r>
-      <w:proofErr w:type="spellStart"/>
-      <w:r>
-        <w:t>Sign</w:t>
-      </w:r>
-      <w:r>
-        <w:t>Servlet</w:t>
-      </w:r>
-      <w:proofErr w:type="spellEnd"/>
-      <w:r>
-        <w:t xml:space="preserve"> </w:t>
-      </w:r>
-      <w:proofErr w:type="spellStart"/>
-      <w:r>
-        <w:t>uebergeben</w:t>
-      </w:r>
-      <w:proofErr w:type="spellEnd"/>
+        <w:t>des Sign</w:t>
+      </w:r>
+      <w:r>
+        <w:t xml:space="preserve">Servlet </w:t>
+      </w:r>
+      <w:r>
+        <w:t>übergeben</w:t>
+      </w:r>
       <w:r>
         <w:t xml:space="preserve"> wurden.</w:t>
       </w:r>
@@ -5319,49 +4408,20 @@
         <w:pStyle w:val="Heading3"/>
       </w:pPr>
       <w:bookmarkStart w:id="13" w:name="_Toc396214458"/>
-      <w:proofErr w:type="spellStart"/>
-      <w:r>
-        <w:t>PDFData</w:t>
-      </w:r>
-      <w:proofErr w:type="spellEnd"/>
-      <w:r>
-        <w:t xml:space="preserve"> Servlet</w:t>
+      <w:r>
+        <w:t>PDFData Servlet</w:t>
       </w:r>
       <w:bookmarkEnd w:id="13"/>
     </w:p>
     <w:p>
       <w:r>
-        <w:t xml:space="preserve">Das </w:t>
-      </w:r>
-      <w:proofErr w:type="spellStart"/>
-      <w:r>
-        <w:t>PDFData</w:t>
-      </w:r>
-      <w:proofErr w:type="spellEnd"/>
-      <w:r>
-        <w:t xml:space="preserve"> Servlet returniert</w:t>
+        <w:t>Das PDFData Servlet returniert</w:t>
       </w:r>
       <w:r>
         <w:t>, falls vorhanden,</w:t>
       </w:r>
       <w:r>
-        <w:t xml:space="preserve"> das signierte </w:t>
-      </w:r>
-      <w:proofErr w:type="gramStart"/>
-      <w:r>
-        <w:t>PDF Dokument</w:t>
-      </w:r>
-      <w:proofErr w:type="gramEnd"/>
-      <w:r>
-        <w:t xml:space="preserve">. Vorsicht: Dieses Servlet kann nur ein einziges Mal pro Signaturvorgang aufgerufen werden. Nachdem das signierte Dokument abgeholt wurde, werden die Daten des signierten </w:t>
-      </w:r>
-      <w:proofErr w:type="gramStart"/>
-      <w:r>
-        <w:t>PDF Dokumentes</w:t>
-      </w:r>
-      <w:proofErr w:type="gramEnd"/>
-      <w:r>
-        <w:t xml:space="preserve"> </w:t>
+        <w:t xml:space="preserve"> das signierte PDF Dokument. Vorsicht: Dieses Servlet kann nur ein einziges Mal pro Signaturvorgang aufgerufen werden. Nachdem das signierte Dokument abgeholt wurde, werden die Daten des signierten PDF Dokumentes </w:t>
       </w:r>
       <w:r>
         <w:t>gelöscht</w:t>
@@ -5381,24 +4441,14 @@
       <w:r>
         <w:t>„</w:t>
       </w:r>
-      <w:proofErr w:type="spellStart"/>
       <w:r>
         <w:rPr>
           <w:b/>
         </w:rPr>
         <w:t>origdigest</w:t>
       </w:r>
-      <w:proofErr w:type="spellEnd"/>
-      <w:r>
-        <w:t xml:space="preserve">“: Dieser </w:t>
-      </w:r>
-      <w:proofErr w:type="gramStart"/>
-      <w:r>
-        <w:t>Parameter  kann</w:t>
-      </w:r>
-      <w:proofErr w:type="gramEnd"/>
-      <w:r>
-        <w:t xml:space="preserve"> den Hex kodierten SHA256 Wert </w:t>
+      <w:r>
+        <w:t xml:space="preserve">“: Dieser Parameter  kann den Hex kodierten SHA256 Wert </w:t>
       </w:r>
       <w:r>
         <w:t>des Originald</w:t>
@@ -5406,11 +4456,9 @@
       <w:r>
         <w:t xml:space="preserve">okuments enthalten. Wenn dieser Parameter angegeben wird, </w:t>
       </w:r>
-      <w:proofErr w:type="spellStart"/>
-      <w:r>
-        <w:t>prueft</w:t>
-      </w:r>
-      <w:proofErr w:type="spellEnd"/>
+      <w:r>
+        <w:t>prüft</w:t>
+      </w:r>
       <w:r>
         <w:t xml:space="preserve"> PDF-AS-WEB</w:t>
       </w:r>
@@ -5426,11 +4474,9 @@
       <w:r>
         <w:t xml:space="preserve"> Daten </w:t>
       </w:r>
-      <w:proofErr w:type="spellStart"/>
-      <w:r>
-        <w:t>uebereinstimmt</w:t>
-      </w:r>
-      <w:proofErr w:type="spellEnd"/>
+      <w:r>
+        <w:t>übereinstimmt</w:t>
+      </w:r>
       <w:r>
         <w:t xml:space="preserve">. Nur wenn dieser </w:t>
       </w:r>
@@ -5464,67 +4510,19 @@
     </w:p>
     <w:p>
       <w:r>
-        <w:t xml:space="preserve">Das </w:t>
-      </w:r>
-      <w:proofErr w:type="spellStart"/>
-      <w:r>
-        <w:t>PDFData</w:t>
-      </w:r>
-      <w:proofErr w:type="spellEnd"/>
-      <w:r>
-        <w:t xml:space="preserve"> Servlet returniert auch das Zertifikat mit welchem die Signatur durchgeführt wurde. Dieses Zertifikat ist als Server Header „</w:t>
-      </w:r>
-      <w:proofErr w:type="spellStart"/>
-      <w:r>
-        <w:t>Signer-Certificate</w:t>
-      </w:r>
-      <w:proofErr w:type="spellEnd"/>
-      <w:r>
-        <w:t xml:space="preserve">“ in der Response zu finden. </w:t>
-      </w:r>
-      <w:r>
-        <w:t>Auch das Ergebnis der automatisch durchgeführten Signaturprüfung nach dem Signaturvorgang wird über die Server Header übergeben. Die Server Header „</w:t>
-      </w:r>
-      <w:proofErr w:type="spellStart"/>
-      <w:r>
-        <w:t>CertificateCheckCode</w:t>
-      </w:r>
-      <w:proofErr w:type="spellEnd"/>
-      <w:r>
-        <w:t>“ und „</w:t>
-      </w:r>
-      <w:proofErr w:type="spellStart"/>
-      <w:r>
-        <w:t>ValueCheckCode</w:t>
-      </w:r>
-      <w:proofErr w:type="spellEnd"/>
-      <w:r>
-        <w:t xml:space="preserve">“ sind in der </w:t>
+        <w:t xml:space="preserve">Das PDFData Servlet returniert auch das Zertifikat mit welchem die Signatur durchgeführt wurde. Dieses Zertifikat ist als Server Header „Signer-Certificate“ in der Response zu finden. </w:t>
+      </w:r>
+      <w:r>
+        <w:t xml:space="preserve">Auch das Ergebnis der automatisch durchgeführten Signaturprüfung nach dem Signaturvorgang wird über die Server Header übergeben. Die Server Header „CertificateCheckCode“ und „ValueCheckCode“ sind in der </w:t>
       </w:r>
       <w:r>
         <w:lastRenderedPageBreak/>
-        <w:t xml:space="preserve">Antwort des </w:t>
-      </w:r>
-      <w:proofErr w:type="spellStart"/>
-      <w:r>
-        <w:t>PDFData</w:t>
-      </w:r>
-      <w:proofErr w:type="spellEnd"/>
-      <w:r>
-        <w:t xml:space="preserve"> Servlet enthalten. Die Werte dieser beiden Header entsprechen den Werten eine MOA Signaturprüfung:</w:t>
-      </w:r>
-    </w:p>
-    <w:p>
-      <w:r>
-        <w:t>„</w:t>
-      </w:r>
-      <w:proofErr w:type="spellStart"/>
-      <w:r>
-        <w:t>ValueCheckCode</w:t>
-      </w:r>
-      <w:proofErr w:type="spellEnd"/>
-      <w:r>
-        <w:t>“ Werte sind:</w:t>
+        <w:t>Antwort des PDFData Servlet enthalten. Die Werte dieser beiden Header entsprechen den Werten eine MOA Signaturprüfung:</w:t>
+      </w:r>
+    </w:p>
+    <w:p>
+      <w:r>
+        <w:t>„ValueCheckCode“ Werte sind:</w:t>
       </w:r>
     </w:p>
     <w:tbl>
@@ -5667,15 +4665,7 @@
     <w:p/>
     <w:p>
       <w:r>
-        <w:t>„</w:t>
-      </w:r>
-      <w:proofErr w:type="spellStart"/>
-      <w:r>
-        <w:t>CertificateCheckCode</w:t>
-      </w:r>
-      <w:proofErr w:type="spellEnd"/>
-      <w:r>
-        <w:t>“ Werte sind:</w:t>
+        <w:t>„CertificateCheckCode“ Werte sind:</w:t>
       </w:r>
     </w:p>
     <w:tbl>
@@ -5772,15 +4762,7 @@
               <w:cnfStyle w:val="000000000000" w:firstRow="0" w:lastRow="0" w:firstColumn="0" w:lastColumn="0" w:oddVBand="0" w:evenVBand="0" w:oddHBand="0" w:evenHBand="0" w:firstRowFirstColumn="0" w:firstRowLastColumn="0" w:lastRowFirstColumn="0" w:lastRowLastColumn="0"/>
             </w:pPr>
             <w:r>
-              <w:t xml:space="preserve">Eine formal korrekte Zertifikatskette vom </w:t>
-            </w:r>
-            <w:proofErr w:type="spellStart"/>
-            <w:r>
-              <w:t>Signatorzertifikat</w:t>
-            </w:r>
-            <w:proofErr w:type="spellEnd"/>
-            <w:r>
-              <w:t xml:space="preserve"> zu einem vertrauenswürdigen Wurzelzertifikat konnte konstruiert werden. Jedes Zertifikat dieser Kette ist zum in der Anfrage angegebenen Prüfzeitpunkt gültig.</w:t>
+              <w:t>Eine formal korrekte Zertifikatskette vom Signatorzertifikat zu einem vertrauenswürdigen Wurzelzertifikat konnte konstruiert werden. Jedes Zertifikat dieser Kette ist zum in der Anfrage angegebenen Prüfzeitpunkt gültig.</w:t>
             </w:r>
           </w:p>
         </w:tc>
@@ -5817,15 +4799,7 @@
               <w:cnfStyle w:val="000000010000" w:firstRow="0" w:lastRow="0" w:firstColumn="0" w:lastColumn="0" w:oddVBand="0" w:evenVBand="0" w:oddHBand="0" w:evenHBand="1" w:firstRowFirstColumn="0" w:firstRowLastColumn="0" w:lastRowFirstColumn="0" w:lastRowLastColumn="0"/>
             </w:pPr>
             <w:r>
-              <w:t xml:space="preserve">Es konnte keine formal korrekte Zertifikatskette vom </w:t>
-            </w:r>
-            <w:proofErr w:type="spellStart"/>
-            <w:r>
-              <w:t>Signatorzertifikat</w:t>
-            </w:r>
-            <w:proofErr w:type="spellEnd"/>
-            <w:r>
-              <w:t xml:space="preserve"> zu einem vertrauenswürdigen Wurzelzertifikat konstruiert werden.</w:t>
+              <w:t>Es konnte keine formal korrekte Zertifikatskette vom Signatorzertifikat zu einem vertrauenswürdigen Wurzelzertifikat konstruiert werden.</w:t>
             </w:r>
           </w:p>
         </w:tc>
@@ -5859,15 +4833,7 @@
               <w:cnfStyle w:val="000000000000" w:firstRow="0" w:lastRow="0" w:firstColumn="0" w:lastColumn="0" w:oddVBand="0" w:evenVBand="0" w:oddHBand="0" w:evenHBand="0" w:firstRowFirstColumn="0" w:firstRowLastColumn="0" w:lastRowFirstColumn="0" w:lastRowLastColumn="0"/>
             </w:pPr>
             <w:r>
-              <w:t xml:space="preserve">Eine formal korrekte Zertifikatskette vom </w:t>
-            </w:r>
-            <w:proofErr w:type="spellStart"/>
-            <w:r>
-              <w:t>Signatorzertifikat</w:t>
-            </w:r>
-            <w:proofErr w:type="spellEnd"/>
-            <w:r>
-              <w:t xml:space="preserve"> zu einem vertrauenswürdigen Wurzelzertifikat konnte konstruiert werden. Für zumindest ein Zertifikat dieser Kette fällt der Prüfzeitpunkt nicht in das Gültigkeitsintervall.</w:t>
+              <w:t>Eine formal korrekte Zertifikatskette vom Signatorzertifikat zu einem vertrauenswürdigen Wurzelzertifikat konnte konstruiert werden. Für zumindest ein Zertifikat dieser Kette fällt der Prüfzeitpunkt nicht in das Gültigkeitsintervall.</w:t>
             </w:r>
           </w:p>
         </w:tc>
@@ -5904,15 +4870,7 @@
               <w:cnfStyle w:val="000000010000" w:firstRow="0" w:lastRow="0" w:firstColumn="0" w:lastColumn="0" w:oddVBand="0" w:evenVBand="0" w:oddHBand="0" w:evenHBand="1" w:firstRowFirstColumn="0" w:firstRowLastColumn="0" w:lastRowFirstColumn="0" w:lastRowLastColumn="0"/>
             </w:pPr>
             <w:r>
-              <w:t xml:space="preserve">Eine formal korrekte Zertifikatskette vom </w:t>
-            </w:r>
-            <w:proofErr w:type="spellStart"/>
-            <w:r>
-              <w:t>Signatorzertifikat</w:t>
-            </w:r>
-            <w:proofErr w:type="spellEnd"/>
-            <w:r>
-              <w:t xml:space="preserve"> zu einem vertrauenswürdigen Wurzelzertifikat konnte konstruiert werden. Für alle Zertifikate dieser Kette fällt der Prüfzeitpunkt in das jeweilige Gültigkeitsintervall. Für zumindest ein Zertifikat konnte der Zertifikatstatus nicht festgestellt werden.</w:t>
+              <w:t>Eine formal korrekte Zertifikatskette vom Signatorzertifikat zu einem vertrauenswürdigen Wurzelzertifikat konnte konstruiert werden. Für alle Zertifikate dieser Kette fällt der Prüfzeitpunkt in das jeweilige Gültigkeitsintervall. Für zumindest ein Zertifikat konnte der Zertifikatstatus nicht festgestellt werden.</w:t>
             </w:r>
           </w:p>
         </w:tc>
@@ -5946,15 +4904,7 @@
               <w:cnfStyle w:val="000000000000" w:firstRow="0" w:lastRow="0" w:firstColumn="0" w:lastColumn="0" w:oddVBand="0" w:evenVBand="0" w:oddHBand="0" w:evenHBand="0" w:firstRowFirstColumn="0" w:firstRowLastColumn="0" w:lastRowFirstColumn="0" w:lastRowLastColumn="0"/>
             </w:pPr>
             <w:r>
-              <w:t xml:space="preserve">Eine formal korrekte Zertifikatskette vom </w:t>
-            </w:r>
-            <w:proofErr w:type="spellStart"/>
-            <w:r>
-              <w:t>Signatorzertifikat</w:t>
-            </w:r>
-            <w:proofErr w:type="spellEnd"/>
-            <w:r>
-              <w:t xml:space="preserve"> zu einem vertrauenswürdigen Wurzelzertifikat konnte konstruiert werden. Für alle Zertifikate dieser Kette fällt der Prüfzeitpunkt in das jeweilige Gültigkeitsintervall. Zumindest ein Zertifikat ist zum Prüfzeitpunkt widerrufen.</w:t>
+              <w:t>Eine formal korrekte Zertifikatskette vom Signatorzertifikat zu einem vertrauenswürdigen Wurzelzertifikat konnte konstruiert werden. Für alle Zertifikate dieser Kette fällt der Prüfzeitpunkt in das jeweilige Gültigkeitsintervall. Zumindest ein Zertifikat ist zum Prüfzeitpunkt widerrufen.</w:t>
             </w:r>
           </w:p>
         </w:tc>
@@ -5991,15 +4941,7 @@
               <w:cnfStyle w:val="000000010000" w:firstRow="0" w:lastRow="0" w:firstColumn="0" w:lastColumn="0" w:oddVBand="0" w:evenVBand="0" w:oddHBand="0" w:evenHBand="1" w:firstRowFirstColumn="0" w:firstRowLastColumn="0" w:lastRowFirstColumn="0" w:lastRowLastColumn="0"/>
             </w:pPr>
             <w:r>
-              <w:t xml:space="preserve">Eine formal korrekte Zertifikatskette vom </w:t>
-            </w:r>
-            <w:proofErr w:type="spellStart"/>
-            <w:r>
-              <w:t>Signatorzertifikat</w:t>
-            </w:r>
-            <w:proofErr w:type="spellEnd"/>
-            <w:r>
-              <w:t xml:space="preserve"> zu einem vertrauenswürdigen Wurzelzertifikat konnte konstruiert werden. Für alle Zertifikate dieser Kette fällt der Prüfzeitpunkt in das jeweilige Gültigkeitsintervall. Kein Zertifikat dieser Kette ist zum Prüfzeitpunkt widerrufen. Zumindest ein Zertifikat ist zum Prüfzeitpunkt gesperrt.</w:t>
+              <w:t>Eine formal korrekte Zertifikatskette vom Signatorzertifikat zu einem vertrauenswürdigen Wurzelzertifikat konnte konstruiert werden. Für alle Zertifikate dieser Kette fällt der Prüfzeitpunkt in das jeweilige Gültigkeitsintervall. Kein Zertifikat dieser Kette ist zum Prüfzeitpunkt widerrufen. Zumindest ein Zertifikat ist zum Prüfzeitpunkt gesperrt.</w:t>
             </w:r>
           </w:p>
         </w:tc>
@@ -6045,61 +4987,24 @@
         <w:pStyle w:val="Heading3"/>
       </w:pPr>
       <w:bookmarkStart w:id="14" w:name="_Toc396214459"/>
-      <w:proofErr w:type="spellStart"/>
       <w:r>
         <w:lastRenderedPageBreak/>
-        <w:t>Verifikations</w:t>
-      </w:r>
-      <w:proofErr w:type="spellEnd"/>
-      <w:r>
-        <w:t xml:space="preserve"> Servlet</w:t>
+        <w:t>Verifikations Servlet</w:t>
       </w:r>
       <w:bookmarkEnd w:id="14"/>
     </w:p>
     <w:p>
       <w:r>
-        <w:t xml:space="preserve">Das </w:t>
-      </w:r>
-      <w:proofErr w:type="spellStart"/>
-      <w:r>
-        <w:t>Verifikations</w:t>
-      </w:r>
-      <w:proofErr w:type="spellEnd"/>
-      <w:r>
-        <w:t xml:space="preserve"> Servlet ist unter „</w:t>
+        <w:t>Das Verifikations Servlet ist unter „</w:t>
       </w:r>
       <w:r>
         <w:rPr>
           <w:b/>
         </w:rPr>
-        <w:t>/</w:t>
-      </w:r>
-      <w:proofErr w:type="spellStart"/>
-      <w:r>
-        <w:rPr>
-          <w:b/>
-        </w:rPr>
-        <w:t>Verify</w:t>
-      </w:r>
-      <w:proofErr w:type="spellEnd"/>
-      <w:r>
-        <w:t xml:space="preserve">“ erreichbar. Mit diesem Servlet können Signaturen in </w:t>
-      </w:r>
-      <w:proofErr w:type="gramStart"/>
-      <w:r>
-        <w:t>PDF Dokumenten</w:t>
-      </w:r>
-      <w:proofErr w:type="gramEnd"/>
-      <w:r>
-        <w:t xml:space="preserve"> verifiziert werden. </w:t>
-      </w:r>
-      <w:proofErr w:type="gramStart"/>
-      <w:r>
-        <w:t>Diese Servlet</w:t>
-      </w:r>
-      <w:proofErr w:type="gramEnd"/>
-      <w:r>
-        <w:t xml:space="preserve"> unterstützt folgende Parameter:</w:t>
+        <w:t>/Verify</w:t>
+      </w:r>
+      <w:r>
+        <w:t>“ erreichbar. Mit diesem Servlet können Signaturen in PDF Dokumenten verifiziert werden. Diese Servlet unterstützt folgende Parameter:</w:t>
       </w:r>
     </w:p>
     <w:p>
@@ -6119,62 +5024,25 @@
         </w:rPr>
         <w:t>„</w:t>
       </w:r>
-      <w:proofErr w:type="spellStart"/>
       <w:r>
         <w:rPr>
           <w:b/>
           <w:lang w:val="de-AT"/>
         </w:rPr>
-        <w:t>pdf</w:t>
-      </w:r>
-      <w:proofErr w:type="spellEnd"/>
+        <w:t>pdf-f</w:t>
+      </w:r>
       <w:r>
         <w:rPr>
           <w:b/>
           <w:lang w:val="de-AT"/>
         </w:rPr>
-        <w:t>-f</w:t>
-      </w:r>
-      <w:r>
-        <w:rPr>
-          <w:b/>
-          <w:lang w:val="de-AT"/>
-        </w:rPr>
         <w:t>ile</w:t>
       </w:r>
       <w:r>
         <w:rPr>
           <w:lang w:val="de-AT"/>
         </w:rPr>
-        <w:t xml:space="preserve">“: Dieser Parameter gibt den File Parameter an beim </w:t>
-      </w:r>
-      <w:proofErr w:type="spellStart"/>
-      <w:r>
-        <w:rPr>
-          <w:lang w:val="de-AT"/>
-        </w:rPr>
-        <w:t>upload</w:t>
-      </w:r>
-      <w:proofErr w:type="spellEnd"/>
-      <w:r>
-        <w:rPr>
-          <w:lang w:val="de-AT"/>
-        </w:rPr>
-        <w:t xml:space="preserve"> des </w:t>
-      </w:r>
-      <w:proofErr w:type="gramStart"/>
-      <w:r>
-        <w:rPr>
-          <w:lang w:val="de-AT"/>
-        </w:rPr>
-        <w:t>PDF Dokuments</w:t>
-      </w:r>
-      <w:proofErr w:type="gramEnd"/>
-      <w:r>
-        <w:rPr>
-          <w:lang w:val="de-AT"/>
-        </w:rPr>
-        <w:t xml:space="preserve"> mittels POST Methode. </w:t>
+        <w:t xml:space="preserve">“: Dieser Parameter gibt den File Parameter an beim upload des PDF Dokuments mittels POST Methode. </w:t>
       </w:r>
       <w:r>
         <w:t>(</w:t>
@@ -6206,7 +5074,6 @@
         </w:rPr>
         <w:t>„</w:t>
       </w:r>
-      <w:proofErr w:type="spellStart"/>
       <w:r>
         <w:rPr>
           <w:b/>
@@ -6214,26 +5081,11 @@
         </w:rPr>
         <w:t>pdf-url</w:t>
       </w:r>
-      <w:proofErr w:type="spellEnd"/>
-      <w:r>
-        <w:rPr>
-          <w:lang w:val="de-AT"/>
-        </w:rPr>
-        <w:t xml:space="preserve">“: Dieser Parameter gibt die URL an, von der das zu verifizierende </w:t>
-      </w:r>
-      <w:proofErr w:type="gramStart"/>
-      <w:r>
-        <w:rPr>
-          <w:lang w:val="de-AT"/>
-        </w:rPr>
-        <w:t>PDF Dokument</w:t>
-      </w:r>
-      <w:proofErr w:type="gramEnd"/>
-      <w:r>
-        <w:rPr>
-          <w:lang w:val="de-AT"/>
-        </w:rPr>
-        <w:t xml:space="preserve"> heruntergeladen werden soll. </w:t>
+      <w:r>
+        <w:rPr>
+          <w:lang w:val="de-AT"/>
+        </w:rPr>
+        <w:t xml:space="preserve">“: Dieser Parameter gibt die URL an, von der das zu verifizierende PDF Dokument heruntergeladen werden soll. </w:t>
       </w:r>
       <w:r>
         <w:t>(</w:t>
@@ -6259,19 +5111,11 @@
       <w:r>
         <w:t>„</w:t>
       </w:r>
-      <w:proofErr w:type="spellStart"/>
       <w:r>
         <w:rPr>
           <w:b/>
         </w:rPr>
-        <w:t>verify</w:t>
-      </w:r>
-      <w:proofErr w:type="spellEnd"/>
-      <w:r>
-        <w:rPr>
-          <w:b/>
-        </w:rPr>
-        <w:t>-level</w:t>
+        <w:t>verify-level</w:t>
       </w:r>
       <w:r>
         <w:t>“: Mit diesem Parameter lässt sich festlegen, welche Art von Signaturverifikation nach dem Signaturvorgang durchgeführt werden soll.</w:t>
@@ -6288,14 +5132,12 @@
       <w:r>
         <w:t>„</w:t>
       </w:r>
-      <w:proofErr w:type="spellStart"/>
       <w:r>
         <w:rPr>
           <w:i/>
         </w:rPr>
         <w:t>full</w:t>
       </w:r>
-      <w:proofErr w:type="spellEnd"/>
       <w:r>
         <w:t>“:</w:t>
       </w:r>
@@ -6318,14 +5160,12 @@
       <w:r>
         <w:t>„</w:t>
       </w:r>
-      <w:proofErr w:type="spellStart"/>
       <w:r>
         <w:rPr>
           <w:i/>
         </w:rPr>
         <w:t>intOnly</w:t>
       </w:r>
-      <w:proofErr w:type="spellEnd"/>
       <w:r>
         <w:t>“:</w:t>
       </w:r>
@@ -6345,14 +5185,12 @@
       <w:r>
         <w:t>„</w:t>
       </w:r>
-      <w:proofErr w:type="spellStart"/>
       <w:r>
         <w:rPr>
           <w:b/>
         </w:rPr>
         <w:t>format</w:t>
       </w:r>
-      <w:proofErr w:type="spellEnd"/>
       <w:r>
         <w:t xml:space="preserve">“: </w:t>
       </w:r>
@@ -6379,27 +5217,11 @@
         </w:numPr>
       </w:pPr>
       <w:r>
-        <w:t>„</w:t>
-      </w:r>
-      <w:proofErr w:type="spellStart"/>
-      <w:r>
-        <w:t>html</w:t>
-      </w:r>
-      <w:proofErr w:type="spellEnd"/>
-      <w:r>
-        <w:t>“:</w:t>
+        <w:t>„html“:</w:t>
       </w:r>
       <w:r>
         <w:tab/>
-        <w:t xml:space="preserve">Dies erzeugt eine einfache HTML Seite mit den </w:t>
-      </w:r>
-      <w:proofErr w:type="spellStart"/>
-      <w:r>
-        <w:t>Verifikationsresulaten</w:t>
-      </w:r>
-      <w:proofErr w:type="spellEnd"/>
-      <w:r>
-        <w:t>.</w:t>
+        <w:t>Dies erzeugt eine einfache HTML Seite mit den Verifikationsresulaten.</w:t>
       </w:r>
     </w:p>
     <w:p>
@@ -6411,15 +5233,7 @@
         </w:numPr>
       </w:pPr>
       <w:r>
-        <w:t>„</w:t>
-      </w:r>
-      <w:proofErr w:type="spellStart"/>
-      <w:r>
-        <w:t>json</w:t>
-      </w:r>
-      <w:proofErr w:type="spellEnd"/>
-      <w:r>
-        <w:t>“:</w:t>
+        <w:t>„json“:</w:t>
       </w:r>
       <w:r>
         <w:tab/>
@@ -6462,26 +5276,13 @@
       </w:pPr>
       <w:bookmarkStart w:id="16" w:name="_Toc396214461"/>
       <w:r>
-        <w:t xml:space="preserve">Abrufen des originalen </w:t>
-      </w:r>
-      <w:proofErr w:type="gramStart"/>
-      <w:r>
-        <w:t>PDF Dokuments</w:t>
+        <w:t>Abrufen des originalen PDF Dokuments</w:t>
       </w:r>
       <w:bookmarkEnd w:id="16"/>
-      <w:proofErr w:type="gramEnd"/>
-    </w:p>
-    <w:p>
-      <w:r>
-        <w:t xml:space="preserve">Wenn PDF-AS-WEB das </w:t>
-      </w:r>
-      <w:proofErr w:type="gramStart"/>
-      <w:r>
-        <w:t>PDF Dokument</w:t>
-      </w:r>
-      <w:proofErr w:type="gramEnd"/>
-      <w:r>
-        <w:t xml:space="preserve"> von der externen Webanwendung herunterladen soll. Werden von PDF-AS keine Parameter </w:t>
+    </w:p>
+    <w:p>
+      <w:r>
+        <w:t xml:space="preserve">Wenn PDF-AS-WEB das PDF Dokument von der externen Webanwendung herunterladen soll. Werden von PDF-AS keine Parameter </w:t>
       </w:r>
       <w:r>
         <w:t>übergeben</w:t>
@@ -6489,7 +5290,6 @@
       <w:r>
         <w:t xml:space="preserve">, sondern nur die URL die mit </w:t>
       </w:r>
-      <w:proofErr w:type="spellStart"/>
       <w:r>
         <w:rPr>
           <w:b/>
@@ -6497,42 +5297,20 @@
         </w:rPr>
         <w:t>pdf-url</w:t>
       </w:r>
-      <w:proofErr w:type="spellEnd"/>
-      <w:r>
-        <w:t xml:space="preserve"> an das </w:t>
-      </w:r>
-      <w:proofErr w:type="spellStart"/>
-      <w:r>
-        <w:t>Sign</w:t>
-      </w:r>
-      <w:proofErr w:type="spellEnd"/>
-      <w:r>
-        <w:t xml:space="preserve"> Servlet </w:t>
+      <w:r>
+        <w:t xml:space="preserve"> an das Sign Servlet </w:t>
       </w:r>
       <w:r>
         <w:t>übergeben</w:t>
       </w:r>
       <w:r>
-        <w:t xml:space="preserve"> wurde aufgerufen. PDF-AS-WEB bietet ein </w:t>
-      </w:r>
-      <w:proofErr w:type="spellStart"/>
-      <w:r>
-        <w:t>Whitelisting</w:t>
-      </w:r>
-      <w:proofErr w:type="spellEnd"/>
-      <w:r>
-        <w:t xml:space="preserve"> um </w:t>
-      </w:r>
-      <w:proofErr w:type="spellStart"/>
+        <w:t xml:space="preserve"> wurde aufgerufen. PDF-AS-WEB bietet ein Whitelisting um </w:t>
+      </w:r>
       <w:r>
         <w:t>pdf-url</w:t>
       </w:r>
       <w:r>
-        <w:t>s</w:t>
-      </w:r>
-      <w:proofErr w:type="spellEnd"/>
-      <w:r>
-        <w:t xml:space="preserve"> zu filtern.</w:t>
+        <w:t>s zu filtern.</w:t>
       </w:r>
     </w:p>
     <w:p>
@@ -6549,58 +5327,19 @@
       <w:r>
         <w:t xml:space="preserve">Wenn in PDF-AS-WEB eine externen </w:t>
       </w:r>
-      <w:proofErr w:type="spellStart"/>
-      <w:r>
-        <w:t>Fehlerurl</w:t>
-      </w:r>
-      <w:proofErr w:type="spellEnd"/>
-      <w:r>
-        <w:t xml:space="preserve"> </w:t>
+      <w:r>
+        <w:t xml:space="preserve">Fehlerurl </w:t>
       </w:r>
       <w:r>
         <w:t xml:space="preserve">mit dem Parameter </w:t>
       </w:r>
-      <w:proofErr w:type="spellStart"/>
       <w:r>
         <w:rPr>
           <w:b/>
           <w:i/>
         </w:rPr>
-        <w:t>invoke</w:t>
-      </w:r>
-      <w:proofErr w:type="spellEnd"/>
-      <w:r>
-        <w:rPr>
-          <w:b/>
-          <w:i/>
-        </w:rPr>
-        <w:t>-</w:t>
-      </w:r>
-      <w:proofErr w:type="spellStart"/>
-      <w:r>
-        <w:rPr>
-          <w:b/>
-          <w:i/>
-        </w:rPr>
-        <w:t>app</w:t>
-      </w:r>
-      <w:proofErr w:type="spellEnd"/>
-      <w:r>
-        <w:rPr>
-          <w:b/>
-          <w:i/>
-        </w:rPr>
-        <w:t>-error-</w:t>
-      </w:r>
-      <w:proofErr w:type="spellStart"/>
-      <w:r>
-        <w:rPr>
-          <w:b/>
-          <w:i/>
-        </w:rPr>
-        <w:t>url</w:t>
-      </w:r>
-      <w:proofErr w:type="spellEnd"/>
+        <w:t>invoke-app-error-url</w:t>
+      </w:r>
       <w:r>
         <w:t xml:space="preserve"> </w:t>
       </w:r>
@@ -6629,14 +5368,12 @@
         <w:lastRenderedPageBreak/>
         <w:t>„</w:t>
       </w:r>
-      <w:proofErr w:type="spellStart"/>
       <w:r>
         <w:rPr>
           <w:b/>
         </w:rPr>
         <w:t>error</w:t>
       </w:r>
-      <w:proofErr w:type="spellEnd"/>
       <w:r>
         <w:t xml:space="preserve">“: Dieser Parameter </w:t>
       </w:r>
@@ -6658,14 +5395,12 @@
       <w:r>
         <w:t>„</w:t>
       </w:r>
-      <w:proofErr w:type="spellStart"/>
       <w:r>
         <w:rPr>
           <w:b/>
         </w:rPr>
         <w:t>cause</w:t>
       </w:r>
-      <w:proofErr w:type="spellEnd"/>
       <w:r>
         <w:t xml:space="preserve">“: Dieser Parameter </w:t>
       </w:r>
@@ -6684,23 +5419,7 @@
     </w:p>
     <w:p>
       <w:r>
-        <w:t xml:space="preserve">PDF-AS-WEB bietet ein </w:t>
-      </w:r>
-      <w:proofErr w:type="spellStart"/>
-      <w:r>
-        <w:t>Whitelisting</w:t>
-      </w:r>
-      <w:proofErr w:type="spellEnd"/>
-      <w:r>
-        <w:t xml:space="preserve"> um </w:t>
-      </w:r>
-      <w:proofErr w:type="spellStart"/>
-      <w:r>
-        <w:t>Fehlerurls</w:t>
-      </w:r>
-      <w:proofErr w:type="spellEnd"/>
-      <w:r>
-        <w:t xml:space="preserve"> zu filtern.</w:t>
+        <w:t>PDF-AS-WEB bietet ein Whitelisting um Fehlerurls zu filtern.</w:t>
       </w:r>
     </w:p>
     <w:p>
@@ -6715,17 +5434,8 @@
     </w:p>
     <w:p>
       <w:r>
-        <w:t xml:space="preserve">Wenn in PDF-AS-WEB eine </w:t>
-      </w:r>
-      <w:proofErr w:type="spellStart"/>
-      <w:r>
-        <w:t>Fertigstellungsurl</w:t>
-      </w:r>
-      <w:proofErr w:type="spellEnd"/>
-      <w:r>
-        <w:t xml:space="preserve"> mit dem Parameter </w:t>
-      </w:r>
-      <w:proofErr w:type="spellStart"/>
+        <w:t xml:space="preserve">Wenn in PDF-AS-WEB eine Fertigstellungsurl mit dem Parameter </w:t>
+      </w:r>
       <w:r>
         <w:rPr>
           <w:b/>
@@ -6733,7 +5443,6 @@
         </w:rPr>
         <w:t>invoke-app-url</w:t>
       </w:r>
-      <w:proofErr w:type="spellEnd"/>
       <w:r>
         <w:rPr>
           <w:b/>
@@ -6781,14 +5490,12 @@
       <w:r>
         <w:t>„</w:t>
       </w:r>
-      <w:proofErr w:type="spellStart"/>
       <w:r>
         <w:rPr>
           <w:b/>
         </w:rPr>
         <w:t>pdfurl</w:t>
       </w:r>
-      <w:proofErr w:type="spellEnd"/>
       <w:r>
         <w:t>“: Die URL unter der das signierte Dokument abgerufen werden kann.</w:t>
       </w:r>
@@ -6804,37 +5511,19 @@
       <w:r>
         <w:t>„</w:t>
       </w:r>
-      <w:proofErr w:type="spellStart"/>
       <w:r>
         <w:rPr>
           <w:b/>
         </w:rPr>
         <w:t>pdflength</w:t>
       </w:r>
-      <w:proofErr w:type="spellEnd"/>
       <w:r>
         <w:t>“: Die Anzahl der Bytes die das signierte Dokument hat.</w:t>
       </w:r>
     </w:p>
     <w:p>
       <w:r>
-        <w:t xml:space="preserve">PDF-AS-WEB bietet ein </w:t>
-      </w:r>
-      <w:proofErr w:type="spellStart"/>
-      <w:r>
-        <w:t>Whitelisting</w:t>
-      </w:r>
-      <w:proofErr w:type="spellEnd"/>
-      <w:r>
-        <w:t xml:space="preserve"> um </w:t>
-      </w:r>
-      <w:proofErr w:type="spellStart"/>
-      <w:r>
-        <w:t>Fertigstellungsurl</w:t>
-      </w:r>
-      <w:proofErr w:type="spellEnd"/>
-      <w:r>
-        <w:t xml:space="preserve"> zu filtern.</w:t>
+        <w:t>PDF-AS-WEB bietet ein Whitelisting um Fertigstellungsurl zu filtern.</w:t>
       </w:r>
     </w:p>
     <w:p/>
@@ -7030,13 +5719,8 @@
               <w:cnfStyle w:val="000000000000" w:firstRow="0" w:lastRow="0" w:firstColumn="0" w:lastColumn="0" w:oddVBand="0" w:evenVBand="0" w:oddHBand="0" w:evenHBand="0" w:firstRowFirstColumn="0" w:firstRowLastColumn="0" w:lastRowFirstColumn="0" w:lastRowLastColumn="0"/>
             </w:pPr>
             <w:r>
-              <w:t xml:space="preserve">Andreas </w:t>
+              <w:t>Andreas Fitzek</w:t>
             </w:r>
-            <w:proofErr w:type="spellStart"/>
-            <w:r>
-              <w:t>Fitzek</w:t>
-            </w:r>
-            <w:proofErr w:type="spellEnd"/>
           </w:p>
         </w:tc>
         <w:tc>
@@ -7106,13 +5790,8 @@
               <w:cnfStyle w:val="000000010000" w:firstRow="0" w:lastRow="0" w:firstColumn="0" w:lastColumn="0" w:oddVBand="0" w:evenVBand="0" w:oddHBand="0" w:evenHBand="1" w:firstRowFirstColumn="0" w:firstRowLastColumn="0" w:lastRowFirstColumn="0" w:lastRowLastColumn="0"/>
             </w:pPr>
             <w:r>
-              <w:t xml:space="preserve">Christian </w:t>
+              <w:t>Christian Maierhofer</w:t>
             </w:r>
-            <w:proofErr w:type="spellStart"/>
-            <w:r>
-              <w:t>Maierhofer</w:t>
-            </w:r>
-            <w:proofErr w:type="spellEnd"/>
           </w:p>
         </w:tc>
         <w:tc>
@@ -7179,13 +5858,8 @@
               <w:cnfStyle w:val="000000000000" w:firstRow="0" w:lastRow="0" w:firstColumn="0" w:lastColumn="0" w:oddVBand="0" w:evenVBand="0" w:oddHBand="0" w:evenHBand="0" w:firstRowFirstColumn="0" w:firstRowLastColumn="0" w:lastRowFirstColumn="0" w:lastRowLastColumn="0"/>
             </w:pPr>
             <w:r>
-              <w:t xml:space="preserve">Andreas </w:t>
+              <w:t>Andreas Fitzek</w:t>
             </w:r>
-            <w:proofErr w:type="spellStart"/>
-            <w:r>
-              <w:t>Fitzek</w:t>
-            </w:r>
-            <w:proofErr w:type="spellEnd"/>
           </w:p>
         </w:tc>
         <w:tc>
@@ -7258,13 +5932,8 @@
               <w:cnfStyle w:val="000000010000" w:firstRow="0" w:lastRow="0" w:firstColumn="0" w:lastColumn="0" w:oddVBand="0" w:evenVBand="0" w:oddHBand="0" w:evenHBand="1" w:firstRowFirstColumn="0" w:firstRowLastColumn="0" w:lastRowFirstColumn="0" w:lastRowLastColumn="0"/>
             </w:pPr>
             <w:r>
-              <w:t xml:space="preserve">Andreas </w:t>
+              <w:t>Andreas Fitzek</w:t>
             </w:r>
-            <w:proofErr w:type="spellStart"/>
-            <w:r>
-              <w:t>Fitzek</w:t>
-            </w:r>
-            <w:proofErr w:type="spellEnd"/>
           </w:p>
         </w:tc>
         <w:tc>
@@ -7279,13 +5948,8 @@
             <w:pPr>
               <w:cnfStyle w:val="000000010000" w:firstRow="0" w:lastRow="0" w:firstColumn="0" w:lastColumn="0" w:oddVBand="0" w:evenVBand="0" w:oddHBand="0" w:evenHBand="1" w:firstRowFirstColumn="0" w:firstRowLastColumn="0" w:lastRowFirstColumn="0" w:lastRowLastColumn="0"/>
             </w:pPr>
-            <w:proofErr w:type="spellStart"/>
             <w:r>
-              <w:t>sig</w:t>
-            </w:r>
-            <w:proofErr w:type="spellEnd"/>
-            <w:r>
-              <w:t>-type Werte hinzugefügt</w:t>
+              <w:t>sig-type Werte hinzugefügt</w:t>
             </w:r>
           </w:p>
         </w:tc>
@@ -7336,13 +6000,8 @@
               <w:cnfStyle w:val="000000000000" w:firstRow="0" w:lastRow="0" w:firstColumn="0" w:lastColumn="0" w:oddVBand="0" w:evenVBand="0" w:oddHBand="0" w:evenHBand="0" w:firstRowFirstColumn="0" w:firstRowLastColumn="0" w:lastRowFirstColumn="0" w:lastRowLastColumn="0"/>
             </w:pPr>
             <w:r>
-              <w:t xml:space="preserve">Andreas </w:t>
+              <w:t>Andreas Fitzek</w:t>
             </w:r>
-            <w:proofErr w:type="spellStart"/>
-            <w:r>
-              <w:t>Fitzek</w:t>
-            </w:r>
-            <w:proofErr w:type="spellEnd"/>
           </w:p>
         </w:tc>
         <w:tc>
@@ -7360,42 +6019,12 @@
                 <w:lang w:val="en-US"/>
               </w:rPr>
             </w:pPr>
-            <w:proofErr w:type="spellStart"/>
             <w:r>
               <w:rPr>
                 <w:lang w:val="en-US"/>
               </w:rPr>
-              <w:t>Erweiterung</w:t>
+              <w:t>Erweiterung invoke-app-url-target, verify-level, Server Headers in PDFData</w:t>
             </w:r>
-            <w:proofErr w:type="spellEnd"/>
-            <w:r>
-              <w:rPr>
-                <w:lang w:val="en-US"/>
-              </w:rPr>
-              <w:t xml:space="preserve"> invoke-app-</w:t>
-            </w:r>
-            <w:proofErr w:type="spellStart"/>
-            <w:r>
-              <w:rPr>
-                <w:lang w:val="en-US"/>
-              </w:rPr>
-              <w:t>url</w:t>
-            </w:r>
-            <w:proofErr w:type="spellEnd"/>
-            <w:r>
-              <w:rPr>
-                <w:lang w:val="en-US"/>
-              </w:rPr>
-              <w:t xml:space="preserve">-target, verify-level, Server Headers in </w:t>
-            </w:r>
-            <w:proofErr w:type="spellStart"/>
-            <w:r>
-              <w:rPr>
-                <w:lang w:val="en-US"/>
-              </w:rPr>
-              <w:t>PDFData</w:t>
-            </w:r>
-            <w:proofErr w:type="spellEnd"/>
           </w:p>
         </w:tc>
       </w:tr>
@@ -7448,13 +6077,8 @@
               <w:cnfStyle w:val="000000010000" w:firstRow="0" w:lastRow="0" w:firstColumn="0" w:lastColumn="0" w:oddVBand="0" w:evenVBand="0" w:oddHBand="0" w:evenHBand="1" w:firstRowFirstColumn="0" w:firstRowLastColumn="0" w:lastRowFirstColumn="0" w:lastRowLastColumn="0"/>
             </w:pPr>
             <w:r>
-              <w:t xml:space="preserve">Andreas </w:t>
+              <w:t>Andreas Fitzek</w:t>
             </w:r>
-            <w:proofErr w:type="spellStart"/>
-            <w:r>
-              <w:t>Fitzek</w:t>
-            </w:r>
-            <w:proofErr w:type="spellEnd"/>
           </w:p>
         </w:tc>
         <w:tc>
@@ -7472,14 +6096,12 @@
                 <w:lang w:val="en-US"/>
               </w:rPr>
             </w:pPr>
-            <w:proofErr w:type="spellStart"/>
             <w:r>
               <w:rPr>
                 <w:lang w:val="en-US"/>
               </w:rPr>
               <w:t>Verifyservlet</w:t>
             </w:r>
-            <w:proofErr w:type="spellEnd"/>
           </w:p>
         </w:tc>
       </w:tr>
@@ -7529,13 +6151,8 @@
               <w:cnfStyle w:val="000000000000" w:firstRow="0" w:lastRow="0" w:firstColumn="0" w:lastColumn="0" w:oddVBand="0" w:evenVBand="0" w:oddHBand="0" w:evenHBand="0" w:firstRowFirstColumn="0" w:firstRowLastColumn="0" w:lastRowFirstColumn="0" w:lastRowLastColumn="0"/>
             </w:pPr>
             <w:r>
-              <w:t xml:space="preserve">Andreas </w:t>
+              <w:t>Andreas Fitzek</w:t>
             </w:r>
-            <w:proofErr w:type="spellStart"/>
-            <w:r>
-              <w:t>Fitzek</w:t>
-            </w:r>
-            <w:proofErr w:type="spellEnd"/>
           </w:p>
         </w:tc>
         <w:tc>
@@ -7611,13 +6228,8 @@
               <w:cnfStyle w:val="000000010000" w:firstRow="0" w:lastRow="0" w:firstColumn="0" w:lastColumn="0" w:oddVBand="0" w:evenVBand="0" w:oddHBand="0" w:evenHBand="1" w:firstRowFirstColumn="0" w:firstRowLastColumn="0" w:lastRowFirstColumn="0" w:lastRowLastColumn="0"/>
             </w:pPr>
             <w:r>
-              <w:t xml:space="preserve">Andreas </w:t>
+              <w:t>Andreas Fitzek</w:t>
             </w:r>
-            <w:proofErr w:type="spellStart"/>
-            <w:r>
-              <w:t>Fitzek</w:t>
-            </w:r>
-            <w:proofErr w:type="spellEnd"/>
           </w:p>
         </w:tc>
         <w:tc>
@@ -7635,33 +6247,11 @@
                 <w:lang w:val="en-US"/>
               </w:rPr>
             </w:pPr>
-            <w:proofErr w:type="spellStart"/>
             <w:r>
               <w:rPr>
                 <w:lang w:val="en-US"/>
               </w:rPr>
-              <w:t>qrcontent</w:t>
-            </w:r>
-            <w:proofErr w:type="spellEnd"/>
-            <w:r>
-              <w:rPr>
-                <w:lang w:val="en-US"/>
-              </w:rPr>
-              <w:t xml:space="preserve">, pp: und </w:t>
-            </w:r>
-            <w:proofErr w:type="spellStart"/>
-            <w:r>
-              <w:rPr>
-                <w:lang w:val="en-US"/>
-              </w:rPr>
-              <w:t>ov</w:t>
-            </w:r>
-            <w:proofErr w:type="spellEnd"/>
-            <w:r>
-              <w:rPr>
-                <w:lang w:val="en-US"/>
-              </w:rPr>
-              <w:t>: Parameter</w:t>
+              <w:t>qrcontent, pp: und ov: Parameter</w:t>
             </w:r>
           </w:p>
         </w:tc>
@@ -7709,13 +6299,8 @@
               <w:cnfStyle w:val="000000000000" w:firstRow="0" w:lastRow="0" w:firstColumn="0" w:lastColumn="0" w:oddVBand="0" w:evenVBand="0" w:oddHBand="0" w:evenHBand="0" w:firstRowFirstColumn="0" w:firstRowLastColumn="0" w:lastRowFirstColumn="0" w:lastRowLastColumn="0"/>
             </w:pPr>
             <w:r>
-              <w:t xml:space="preserve">Alexander </w:t>
+              <w:t>Alexander Marsalek</w:t>
             </w:r>
-            <w:proofErr w:type="spellStart"/>
-            <w:r>
-              <w:t>Marsalek</w:t>
-            </w:r>
-            <w:proofErr w:type="spellEnd"/>
           </w:p>
         </w:tc>
         <w:tc>
@@ -7732,7 +6317,6 @@
                 <w:lang w:val="en-US"/>
               </w:rPr>
             </w:pPr>
-            <w:proofErr w:type="spellStart"/>
             <w:r>
               <w:rPr>
                 <w:lang w:val="en-US"/>
@@ -7743,14 +6327,7 @@
               <w:rPr>
                 <w:lang w:val="en-US"/>
               </w:rPr>
-              <w:t>bp</w:t>
-            </w:r>
-            <w:proofErr w:type="spellEnd"/>
-            <w:r>
-              <w:rPr>
-                <w:lang w:val="en-US"/>
-              </w:rPr>
-              <w:t xml:space="preserve"> Parameter</w:t>
+              <w:t>bp Parameter</w:t>
             </w:r>
           </w:p>
         </w:tc>
@@ -7773,8 +6350,8 @@
       </w:pPr>
     </w:p>
     <w:sectPr>
-      <w:footerReference w:type="default" r:id="rId15"/>
-      <w:footerReference w:type="first" r:id="rId16"/>
+      <w:footerReference w:type="default" r:id="rId16"/>
+      <w:footerReference w:type="first" r:id="rId17"/>
       <w:pgSz w:w="12240" w:h="15840" w:code="1"/>
       <w:pgMar w:top="1077" w:right="1225" w:bottom="1134" w:left="1701" w:header="720" w:footer="720" w:gutter="0"/>
       <w:cols w:space="720"/>
@@ -8164,15 +6741,7 @@
             <w:ind w:left="0"/>
           </w:pPr>
           <w:r>
-            <w:t>E-</w:t>
-          </w:r>
-          <w:proofErr w:type="spellStart"/>
-          <w:r>
-            <w:t>Government</w:t>
-          </w:r>
-          <w:proofErr w:type="spellEnd"/>
-          <w:r>
-            <w:t xml:space="preserve"> Innovationszentrum</w:t>
+            <w:t>E-Government Innovationszentrum</w:t>
           </w:r>
         </w:p>
         <w:p>
@@ -8185,23 +6754,13 @@
               <w:szCs w:val="18"/>
             </w:rPr>
           </w:pPr>
-          <w:proofErr w:type="spellStart"/>
           <w:r>
             <w:rPr>
               <w:rFonts w:asciiTheme="majorHAnsi" w:hAnsiTheme="majorHAnsi"/>
               <w:sz w:val="18"/>
               <w:szCs w:val="18"/>
             </w:rPr>
-            <w:t>Inffeldgasse</w:t>
-          </w:r>
-          <w:proofErr w:type="spellEnd"/>
-          <w:r>
-            <w:rPr>
-              <w:rFonts w:asciiTheme="majorHAnsi" w:hAnsiTheme="majorHAnsi"/>
-              <w:sz w:val="18"/>
-              <w:szCs w:val="18"/>
-            </w:rPr>
-            <w:t xml:space="preserve"> 16/a, A-8010 Graz</w:t>
+            <w:t>Inffeldgasse 16/a, A-8010 Graz</w:t>
           </w:r>
           <w:r>
             <w:rPr>
@@ -8305,23 +6864,7 @@
               <w:sz w:val="18"/>
               <w:szCs w:val="18"/>
             </w:rPr>
-            <w:t xml:space="preserve"> E-</w:t>
-          </w:r>
-          <w:proofErr w:type="spellStart"/>
-          <w:r>
-            <w:rPr>
-              <w:sz w:val="18"/>
-              <w:szCs w:val="18"/>
-            </w:rPr>
-            <w:t>Government</w:t>
-          </w:r>
-          <w:proofErr w:type="spellEnd"/>
-          <w:r>
-            <w:rPr>
-              <w:sz w:val="18"/>
-              <w:szCs w:val="18"/>
-            </w:rPr>
-            <w:t xml:space="preserve"> Innovationszentrum </w:t>
+            <w:t xml:space="preserve"> E-Government Innovationszentrum </w:t>
           </w:r>
           <w:r>
             <w:rPr>
@@ -10474,6 +9017,7 @@
     <w:lsdException w:name="HTML Sample" w:semiHidden="1" w:unhideWhenUsed="1"/>
     <w:lsdException w:name="HTML Typewriter" w:semiHidden="1" w:unhideWhenUsed="1"/>
     <w:lsdException w:name="HTML Variable" w:semiHidden="1" w:unhideWhenUsed="1"/>
+    <w:lsdException w:name="Normal Table" w:semiHidden="1" w:unhideWhenUsed="1"/>
     <w:lsdException w:name="annotation subject" w:semiHidden="1" w:unhideWhenUsed="1"/>
     <w:lsdException w:name="No List" w:semiHidden="1" w:unhideWhenUsed="1"/>
     <w:lsdException w:name="Outline List 1" w:semiHidden="1" w:unhideWhenUsed="1"/>
@@ -10516,8 +9060,11 @@
     <w:lsdException w:name="Table Contemporary" w:semiHidden="1" w:unhideWhenUsed="1"/>
     <w:lsdException w:name="Table Elegant" w:semiHidden="1" w:unhideWhenUsed="1"/>
     <w:lsdException w:name="Table Professional" w:semiHidden="1" w:unhideWhenUsed="1"/>
+    <w:lsdException w:name="Table Subtle 1" w:semiHidden="1" w:unhideWhenUsed="1"/>
     <w:lsdException w:name="Table Subtle 2" w:semiHidden="1" w:unhideWhenUsed="1"/>
     <w:lsdException w:name="Table Web 1" w:semiHidden="1" w:unhideWhenUsed="1"/>
+    <w:lsdException w:name="Table Web 2" w:semiHidden="1" w:unhideWhenUsed="1"/>
+    <w:lsdException w:name="Table Web 3" w:semiHidden="1" w:unhideWhenUsed="1"/>
     <w:lsdException w:name="Balloon Text" w:semiHidden="1" w:unhideWhenUsed="1"/>
     <w:lsdException w:name="Table Grid" w:uiPriority="39"/>
     <w:lsdException w:name="Table Theme" w:semiHidden="1" w:unhideWhenUsed="1"/>

</xml_diff>